<commit_message>
Prepare scoped T2 R2 release candidate after owner acceptance
</commit_message>
<xml_diff>
--- a/products-storage/14-peredacha-id-pod-podpis/01-slovar-poley.docx
+++ b/products-storage/14-peredacha-id-pod-podpis/01-slovar-poley.docx
@@ -5,152 +5,51 @@
     <w:p>
       <w:pPr>
         <w:pStyle w:val="Heading1"/>
-        <w:spacing w:after="200" w:before="240"/>
+        <w:keepNext/>
+        <w:spacing w:after="120" w:before="60" w:line="269" w:lineRule="auto"/>
       </w:pPr>
       <w:r>
         <w:rPr>
-          <w:rFonts w:ascii="Times New Roman" w:cs="Times New Roman" w:eastAsia="Times New Roman" w:hAnsi="Times New Roman"/>
+          <w:rFonts w:ascii="Arial" w:hAnsi="Arial"/>
           <w:b/>
-          <w:bCs/>
-          <w:sz w:val="32"/>
-          <w:szCs w:val="32"/>
+          <w:color w:val="293137"/>
+          <w:sz w:val="30"/>
         </w:rPr>
-        <w:t xml:space="preserve">Как заполнять: словарь полей</w:t>
+        <w:t>Словарь полей и реквизитов</w:t>
       </w:r>
     </w:p>
     <w:p>
       <w:pPr>
-        <w:spacing w:after="120" w:line="276"/>
+        <w:spacing w:after="80" w:line="269" w:before="0" w:lineRule="auto"/>
       </w:pPr>
       <w:r>
         <w:rPr>
-          <w:rFonts w:ascii="Times New Roman" w:cs="Times New Roman" w:eastAsia="Times New Roman" w:hAnsi="Times New Roman"/>
-          <w:i/>
-          <w:iCs/>
-          <w:color w:val="595959"/>
-          <w:sz w:val="24"/>
-          <w:szCs w:val="24"/>
+          <w:rFonts w:ascii="Arial" w:hAnsi="Arial"/>
+          <w:color w:val="293137"/>
+          <w:sz w:val="20"/>
         </w:rPr>
-        <w:t xml:space="preserve">Ключ к остальным файлам: каждое поле в двойных фигурных скобках — что в него вписать и откуда взять значение.</w:t>
+        <w:t>Поля для заполнения сопроводительного письма, описи и акта передачи исполнительной документации.</w:t>
       </w:r>
     </w:p>
-    <w:tbl>
-      <w:tblPr>
-        <w:tblW w:type="dxa" w:w="9360"/>
-        <w:tblBorders>
-          <w:top w:val="single" w:color="auto" w:sz="4"/>
-          <w:left w:val="single" w:color="auto" w:sz="4"/>
-          <w:bottom w:val="single" w:color="auto" w:sz="4"/>
-          <w:right w:val="single" w:color="auto" w:sz="4"/>
-          <w:insideH w:val="single" w:color="auto" w:sz="4"/>
-          <w:insideV w:val="single" w:color="auto" w:sz="4"/>
-        </w:tblBorders>
-      </w:tblPr>
-      <w:tblGrid>
-        <w:gridCol w:w="9360"/>
-      </w:tblGrid>
-      <w:tr>
-        <w:tc>
-          <w:tcPr>
-            <w:tcW w:type="dxa" w:w="9360"/>
-            <w:shd w:fill="F2F2F2" w:val="clear"/>
-            <w:tcMar>
-              <w:top w:type="dxa" w:w="160"/>
-              <w:left w:type="dxa" w:w="200"/>
-              <w:bottom w:type="dxa" w:w="160"/>
-              <w:right w:type="dxa" w:w="200"/>
-            </w:tcMar>
-          </w:tcPr>
-          <w:p>
-            <w:pPr>
-              <w:spacing w:after="100" w:line="276"/>
-            </w:pPr>
-            <w:r>
-              <w:rPr>
-                <w:rFonts w:ascii="Times New Roman" w:cs="Times New Roman" w:eastAsia="Times New Roman" w:hAnsi="Times New Roman"/>
-                <w:b/>
-                <w:bCs/>
-                <w:sz w:val="24"/>
-                <w:szCs w:val="24"/>
-              </w:rPr>
-              <w:t xml:space="preserve">Важно, прочитайте до использования</w:t>
-            </w:r>
-          </w:p>
-          <w:p>
-            <w:pPr>
-              <w:spacing w:after="100" w:line="276"/>
-            </w:pPr>
-            <w:r>
-              <w:rPr>
-                <w:rFonts w:ascii="Times New Roman" w:cs="Times New Roman" w:eastAsia="Times New Roman" w:hAnsi="Times New Roman"/>
-                <w:sz w:val="24"/>
-                <w:szCs w:val="24"/>
-              </w:rPr>
-              <w:t xml:space="preserve">Это типовые шаблоны передачи документации, а не юридическая консультация. Они не обещают, что комплект примут с первого раза и что оплату после передачи разблокируют: часть замечаний приходит независимо от того, как собран и передан комплект. Что они делают — оставляют след: какой документ, в каком составе, кому и когда передан.</w:t>
-            </w:r>
-          </w:p>
-          <w:p>
-            <w:pPr>
-              <w:spacing w:after="100" w:line="276"/>
-            </w:pPr>
-            <w:r>
-              <w:rPr>
-                <w:rFonts w:ascii="Times New Roman" w:cs="Times New Roman" w:eastAsia="Times New Roman" w:hAnsi="Times New Roman"/>
-                <w:sz w:val="24"/>
-                <w:szCs w:val="24"/>
-              </w:rPr>
-              <w:t xml:space="preserve">Тексты прошли вычитку юристом в типовой редакции. Нормативная сверка форм и порядка передачи по ним не проводилась, и вычитка её не заменяет. Приоритет всегда у вашего договора: состав исполнительной документации, форма и адресат передачи, срок рассмотрения и связь передачи с оплатой определяются им, а обязательные требования к формам вы проверяете сами в действующей редакции на дату передачи.</w:t>
-            </w:r>
-          </w:p>
-          <w:p>
-            <w:pPr>
-              <w:spacing w:after="100" w:line="276"/>
-            </w:pPr>
-            <w:r>
-              <w:rPr>
-                <w:rFonts w:ascii="Times New Roman" w:cs="Times New Roman" w:eastAsia="Times New Roman" w:hAnsi="Times New Roman"/>
-                <w:sz w:val="24"/>
-                <w:szCs w:val="24"/>
-              </w:rPr>
-              <w:t xml:space="preserve">Граница проходит по стадии. Пока комплект собран и передаётся, а спора нет — эти файлы работают. Как только комплект возвращён с замечаниями, оплата удержана со ссылкой на документацию, заявлен зачёт, подписан односторонний акт или начат спор о качестве и объёмах — останавливайтесь: дальше нужны разбор замечаний и ответ по пунктам, а при удержании денег — юрист. Типовое сопроводительное письмо в такой ситуации создаёт ложную уверенность.</w:t>
-            </w:r>
-          </w:p>
-          <w:p>
-            <w:pPr>
-              <w:spacing w:after="0" w:line="276"/>
-            </w:pPr>
-            <w:r>
-              <w:rPr>
-                <w:rFonts w:ascii="Times New Roman" w:cs="Times New Roman" w:eastAsia="Times New Roman" w:hAnsi="Times New Roman"/>
-                <w:sz w:val="24"/>
-                <w:szCs w:val="24"/>
-              </w:rPr>
-              <w:t xml:space="preserve">Сроков и норм числом в шаблонах нет намеренно: они меняются, а скачанный файл не обновляется. Срок рассмотрения и порядок передачи вы берёте из своего договора, требования к формам — из действующей редакции на дату документа.</w:t>
-            </w:r>
-          </w:p>
-        </w:tc>
-      </w:tr>
-    </w:tbl>
     <w:p>
       <w:pPr>
-        <w:spacing w:after="120" w:line="276"/>
+        <w:spacing w:after="80" w:line="269" w:before="0" w:lineRule="auto"/>
       </w:pPr>
     </w:p>
     <w:p>
       <w:pPr>
         <w:pStyle w:val="Heading2"/>
         <w:keepNext/>
-        <w:spacing w:after="120" w:before="260"/>
+        <w:spacing w:after="120" w:before="160" w:line="269" w:lineRule="auto"/>
       </w:pPr>
       <w:r>
         <w:rPr>
-          <w:rFonts w:ascii="Times New Roman" w:cs="Times New Roman" w:eastAsia="Times New Roman" w:hAnsi="Times New Roman"/>
+          <w:rFonts w:ascii="Arial" w:hAnsi="Arial"/>
           <w:b/>
-          <w:bCs/>
-          <w:sz w:val="26"/>
-          <w:szCs w:val="26"/>
+          <w:color w:val="A9803D"/>
+          <w:sz w:val="22"/>
         </w:rPr>
-        <w:t xml:space="preserve">Как пользоваться словарём</w:t>
+        <w:t>Порядок заполнения</w:t>
       </w:r>
     </w:p>
     <w:p>
@@ -160,15 +59,16 @@
           <w:ilvl w:val="0"/>
           <w:numId w:val="2"/>
         </w:numPr>
-        <w:spacing w:after="80" w:line="276"/>
+        <w:spacing w:after="80" w:line="269" w:before="0" w:lineRule="auto"/>
+        <w:jc w:val="both"/>
       </w:pPr>
       <w:r>
         <w:rPr>
-          <w:rFonts w:ascii="Times New Roman" w:cs="Times New Roman" w:eastAsia="Times New Roman" w:hAnsi="Times New Roman"/>
-          <w:sz w:val="24"/>
-          <w:szCs w:val="24"/>
+          <w:rFonts w:ascii="Arial" w:hAnsi="Arial"/>
+          <w:color w:val="293137"/>
+          <w:sz w:val="20"/>
         </w:rPr>
-        <w:t xml:space="preserve">Заполните поля по таблицам ниже, затем поиском по документу убедитесь, что скобок «{{» не осталось. Незаполненное поле в отправленном письме читается как небрежность ко всему комплекту.</w:t>
+        <w:t>Заполните поля по таблицам. Перед подписанием и направлением проверьте документ поиском незаполненных маркеров {{...}}.</w:t>
       </w:r>
     </w:p>
     <w:p>
@@ -178,12 +78,13 @@
           <w:ilvl w:val="0"/>
           <w:numId w:val="2"/>
         </w:numPr>
-        <w:spacing w:after="80" w:line="276"/>
+        <w:spacing w:after="80" w:line="269" w:before="0" w:lineRule="auto"/>
       </w:pPr>
       <w:r>
         <w:rPr>
-          <w:rFonts w:ascii="Times New Roman" w:cs="Times New Roman" w:eastAsia="Times New Roman" w:hAnsi="Times New Roman"/>
-          <w:sz w:val="24"/>
+          <w:rFonts w:ascii="Arial" w:cs="Times New Roman" w:eastAsia="Times New Roman" w:hAnsi="Arial"/>
+          <w:color w:val="293137"/>
+          <w:sz w:val="20"/>
           <w:szCs w:val="24"/>
         </w:rPr>
         <w:t xml:space="preserve">Пояснения в квадратных скобках — для вас. Перед отправкой они удаляются вместе со скобками.</w:t>
@@ -196,15 +97,15 @@
           <w:ilvl w:val="0"/>
           <w:numId w:val="2"/>
         </w:numPr>
-        <w:spacing w:after="80" w:line="276"/>
+        <w:spacing w:after="80" w:line="269" w:before="0" w:lineRule="auto"/>
       </w:pPr>
       <w:r>
         <w:rPr>
-          <w:rFonts w:ascii="Times New Roman" w:cs="Times New Roman" w:eastAsia="Times New Roman" w:hAnsi="Times New Roman"/>
-          <w:sz w:val="24"/>
-          <w:szCs w:val="24"/>
+          <w:rFonts w:ascii="Arial" w:hAnsi="Arial"/>
+          <w:color w:val="293137"/>
+          <w:sz w:val="20"/>
         </w:rPr>
-        <w:t xml:space="preserve">Блок «Стороны» общий с остальными комплектами линейки: значения, подставленные в документы других комплектов, переносятся сюда без изменений. Три его поля — банковские реквизиты подрядчика, ИНН и ОГРН заказчика — в документах этого комплекта не встречаются: передача документации их не требует. Они оставлены в таблице, чтобы блок оставался одним и тем же во всех комплектах.</w:t>
+        <w:t>Реквизиты сторон вносите по актуальным данным организаций и документам о полномочиях представителей.</w:t>
       </w:r>
     </w:p>
     <w:p>
@@ -214,29 +115,30 @@
           <w:ilvl w:val="0"/>
           <w:numId w:val="2"/>
         </w:numPr>
-        <w:spacing w:after="80" w:line="276"/>
+        <w:spacing w:after="80" w:line="269" w:before="0" w:lineRule="auto"/>
       </w:pPr>
       <w:r>
         <w:rPr>
-          <w:rFonts w:ascii="Times New Roman" w:cs="Times New Roman" w:eastAsia="Times New Roman" w:hAnsi="Times New Roman"/>
-          <w:sz w:val="24"/>
-          <w:szCs w:val="24"/>
+          <w:rFonts w:ascii="Arial" w:hAnsi="Arial"/>
+          <w:color w:val="293137"/>
+          <w:sz w:val="20"/>
         </w:rPr>
-        <w:t xml:space="preserve">Три поля — число позиций, число листов и номер описи — берутся из файла «Опись передаваемого комплекта» и должны совпадать с ним дословно. Расхождение между письмом и описью — первое, что заметит принимающий.</w:t>
+        <w:t>Количество позиций, число листов и номер описи должны соответствовать файлу 03 без расхождений.</w:t>
       </w:r>
     </w:p>
     <w:p>
       <w:pPr>
         <w:pStyle w:val="Heading2"/>
         <w:keepNext/>
-        <w:spacing w:after="120" w:before="260"/>
+        <w:spacing w:after="120" w:before="160" w:line="269" w:lineRule="auto"/>
       </w:pPr>
       <w:r>
         <w:rPr>
-          <w:rFonts w:ascii="Times New Roman" w:cs="Times New Roman" w:eastAsia="Times New Roman" w:hAnsi="Times New Roman"/>
+          <w:rFonts w:ascii="Arial" w:cs="Times New Roman" w:eastAsia="Times New Roman" w:hAnsi="Arial"/>
           <w:b/>
           <w:bCs/>
-          <w:sz w:val="26"/>
+          <w:color w:val="A9803D"/>
+          <w:sz w:val="22"/>
           <w:szCs w:val="26"/>
         </w:rPr>
         <w:t xml:space="preserve">Стороны</w:t>
@@ -253,6 +155,7 @@
           <w:insideH w:val="single" w:color="auto" w:sz="4"/>
           <w:insideV w:val="single" w:color="auto" w:sz="4"/>
         </w:tblBorders>
+        <w:tblLayout w:type="autofit"/>
       </w:tblPr>
       <w:tblGrid>
         <w:gridCol w:w="3200"/>
@@ -262,28 +165,30 @@
       <w:tr>
         <w:trPr>
           <w:tblHeader/>
+          <w:tblHeader/>
         </w:trPr>
         <w:tc>
           <w:tcPr>
             <w:tcW w:type="dxa" w:w="3200"/>
-            <w:shd w:fill="EDEDED" w:val="clear"/>
-            <w:tcMar>
-              <w:top w:type="dxa" w:w="80"/>
-              <w:left w:type="dxa" w:w="120"/>
-              <w:bottom w:type="dxa" w:w="80"/>
-              <w:right w:type="dxa" w:w="120"/>
-            </w:tcMar>
-          </w:tcPr>
-          <w:p>
-            <w:pPr>
-              <w:spacing w:after="0" w:line="240"/>
-            </w:pPr>
-            <w:r>
-              <w:rPr>
-                <w:rFonts w:ascii="Times New Roman" w:cs="Times New Roman" w:eastAsia="Times New Roman" w:hAnsi="Times New Roman"/>
-                <w:b/>
-                <w:bCs/>
-                <w:sz w:val="22"/>
+            <w:shd w:fill="303941" w:val="clear"/>
+            <w:tcMar>
+              <w:top w:type="dxa" w:w="80"/>
+              <w:left w:type="dxa" w:w="120"/>
+              <w:bottom w:type="dxa" w:w="80"/>
+              <w:right w:type="dxa" w:w="120"/>
+            </w:tcMar>
+          </w:tcPr>
+          <w:p>
+            <w:pPr>
+              <w:spacing w:after="40" w:line="262" w:before="0" w:lineRule="auto"/>
+            </w:pPr>
+            <w:r>
+              <w:rPr>
+                <w:rFonts w:ascii="Arial" w:cs="Times New Roman" w:eastAsia="Times New Roman" w:hAnsi="Arial"/>
+                <w:b/>
+                <w:bCs/>
+                <w:color w:val="FFFFFF"/>
+                <w:sz w:val="18"/>
                 <w:szCs w:val="22"/>
               </w:rPr>
               <w:t xml:space="preserve">Поле</w:t>
@@ -293,24 +198,25 @@
         <w:tc>
           <w:tcPr>
             <w:tcW w:type="dxa" w:w="3300"/>
-            <w:shd w:fill="EDEDED" w:val="clear"/>
-            <w:tcMar>
-              <w:top w:type="dxa" w:w="80"/>
-              <w:left w:type="dxa" w:w="120"/>
-              <w:bottom w:type="dxa" w:w="80"/>
-              <w:right w:type="dxa" w:w="120"/>
-            </w:tcMar>
-          </w:tcPr>
-          <w:p>
-            <w:pPr>
-              <w:spacing w:after="0" w:line="240"/>
-            </w:pPr>
-            <w:r>
-              <w:rPr>
-                <w:rFonts w:ascii="Times New Roman" w:cs="Times New Roman" w:eastAsia="Times New Roman" w:hAnsi="Times New Roman"/>
-                <w:b/>
-                <w:bCs/>
-                <w:sz w:val="22"/>
+            <w:shd w:fill="303941" w:val="clear"/>
+            <w:tcMar>
+              <w:top w:type="dxa" w:w="80"/>
+              <w:left w:type="dxa" w:w="120"/>
+              <w:bottom w:type="dxa" w:w="80"/>
+              <w:right w:type="dxa" w:w="120"/>
+            </w:tcMar>
+          </w:tcPr>
+          <w:p>
+            <w:pPr>
+              <w:spacing w:after="40" w:line="262" w:before="0" w:lineRule="auto"/>
+            </w:pPr>
+            <w:r>
+              <w:rPr>
+                <w:rFonts w:ascii="Arial" w:cs="Times New Roman" w:eastAsia="Times New Roman" w:hAnsi="Arial"/>
+                <w:b/>
+                <w:bCs/>
+                <w:color w:val="FFFFFF"/>
+                <w:sz w:val="18"/>
                 <w:szCs w:val="22"/>
               </w:rPr>
               <w:t xml:space="preserve">Что вписать</w:t>
@@ -320,24 +226,25 @@
         <w:tc>
           <w:tcPr>
             <w:tcW w:type="dxa" w:w="2860"/>
-            <w:shd w:fill="EDEDED" w:val="clear"/>
-            <w:tcMar>
-              <w:top w:type="dxa" w:w="80"/>
-              <w:left w:type="dxa" w:w="120"/>
-              <w:bottom w:type="dxa" w:w="80"/>
-              <w:right w:type="dxa" w:w="120"/>
-            </w:tcMar>
-          </w:tcPr>
-          <w:p>
-            <w:pPr>
-              <w:spacing w:after="0" w:line="240"/>
-            </w:pPr>
-            <w:r>
-              <w:rPr>
-                <w:rFonts w:ascii="Times New Roman" w:cs="Times New Roman" w:eastAsia="Times New Roman" w:hAnsi="Times New Roman"/>
-                <w:b/>
-                <w:bCs/>
-                <w:sz w:val="22"/>
+            <w:shd w:fill="303941" w:val="clear"/>
+            <w:tcMar>
+              <w:top w:type="dxa" w:w="80"/>
+              <w:left w:type="dxa" w:w="120"/>
+              <w:bottom w:type="dxa" w:w="80"/>
+              <w:right w:type="dxa" w:w="120"/>
+            </w:tcMar>
+          </w:tcPr>
+          <w:p>
+            <w:pPr>
+              <w:spacing w:after="40" w:line="262" w:before="0" w:lineRule="auto"/>
+            </w:pPr>
+            <w:r>
+              <w:rPr>
+                <w:rFonts w:ascii="Arial" w:cs="Times New Roman" w:eastAsia="Times New Roman" w:hAnsi="Arial"/>
+                <w:b/>
+                <w:bCs/>
+                <w:color w:val="FFFFFF"/>
+                <w:sz w:val="18"/>
                 <w:szCs w:val="22"/>
               </w:rPr>
               <w:t xml:space="preserve">Откуда взять</w:t>
@@ -358,17 +265,17 @@
           </w:tcPr>
           <w:p>
             <w:pPr>
-              <w:spacing w:after="0" w:line="240"/>
-            </w:pPr>
-            <w:r>
-              <w:rPr>
-                <w:rFonts w:ascii="Times New Roman" w:cs="Times New Roman" w:eastAsia="Times New Roman" w:hAnsi="Times New Roman"/>
-                <w:b/>
-                <w:bCs/>
-                <w:i w:val="false"/>
-                <w:iCs w:val="false"/>
-                <w:color w:val="000000"/>
-                <w:sz w:val="22"/>
+              <w:spacing w:after="40" w:line="262" w:before="0" w:lineRule="auto"/>
+            </w:pPr>
+            <w:r>
+              <w:rPr>
+                <w:rFonts w:ascii="Arial" w:cs="Times New Roman" w:eastAsia="Times New Roman" w:hAnsi="Arial"/>
+                <w:b/>
+                <w:bCs/>
+                <w:i w:val="false"/>
+                <w:iCs w:val="false"/>
+                <w:color w:val="293137"/>
+                <w:sz w:val="18"/>
                 <w:szCs w:val="22"/>
               </w:rPr>
               <w:t xml:space="preserve">{{НАИМЕНОВАНИЕ_ПОДРЯДЧИКА}}</w:t>
@@ -387,14 +294,15 @@
           </w:tcPr>
           <w:p>
             <w:pPr>
-              <w:spacing w:after="0" w:line="240"/>
-            </w:pPr>
-            <w:r>
-              <w:rPr>
-                <w:rFonts w:ascii="Times New Roman" w:cs="Times New Roman" w:eastAsia="Times New Roman" w:hAnsi="Times New Roman"/>
-                <w:b w:val="false"/>
-                <w:bCs w:val="false"/>
-                <w:sz w:val="22"/>
+              <w:spacing w:after="40" w:line="262" w:before="0" w:lineRule="auto"/>
+            </w:pPr>
+            <w:r>
+              <w:rPr>
+                <w:rFonts w:ascii="Arial" w:cs="Times New Roman" w:eastAsia="Times New Roman" w:hAnsi="Arial"/>
+                <w:b w:val="0"/>
+                <w:bCs w:val="false"/>
+                <w:color w:val="293137"/>
+                <w:sz w:val="18"/>
                 <w:szCs w:val="22"/>
               </w:rPr>
               <w:t xml:space="preserve">Полное наименование вашей организации</w:t>
@@ -413,14 +321,15 @@
           </w:tcPr>
           <w:p>
             <w:pPr>
-              <w:spacing w:after="0" w:line="240"/>
-            </w:pPr>
-            <w:r>
-              <w:rPr>
-                <w:rFonts w:ascii="Times New Roman" w:cs="Times New Roman" w:eastAsia="Times New Roman" w:hAnsi="Times New Roman"/>
-                <w:b w:val="false"/>
-                <w:bCs w:val="false"/>
-                <w:sz w:val="22"/>
+              <w:spacing w:after="40" w:line="262" w:before="0" w:lineRule="auto"/>
+            </w:pPr>
+            <w:r>
+              <w:rPr>
+                <w:rFonts w:ascii="Arial" w:cs="Times New Roman" w:eastAsia="Times New Roman" w:hAnsi="Arial"/>
+                <w:b w:val="0"/>
+                <w:bCs w:val="false"/>
+                <w:color w:val="293137"/>
+                <w:sz w:val="18"/>
                 <w:szCs w:val="22"/>
               </w:rPr>
               <w:t xml:space="preserve">учредительные документы, выписка ЕГРЮЛ</w:t>
@@ -438,43 +347,45 @@
               <w:bottom w:type="dxa" w:w="80"/>
               <w:right w:type="dxa" w:w="120"/>
             </w:tcMar>
-          </w:tcPr>
-          <w:p>
-            <w:pPr>
-              <w:spacing w:after="0" w:line="240"/>
-            </w:pPr>
-            <w:r>
-              <w:rPr>
-                <w:rFonts w:ascii="Times New Roman" w:cs="Times New Roman" w:eastAsia="Times New Roman" w:hAnsi="Times New Roman"/>
-                <w:b/>
-                <w:bCs/>
-                <w:i w:val="false"/>
-                <w:iCs w:val="false"/>
-                <w:color w:val="000000"/>
-                <w:sz w:val="22"/>
+            <w:shd w:fill="F4F5F5"/>
+          </w:tcPr>
+          <w:p>
+            <w:pPr>
+              <w:spacing w:after="40" w:line="262" w:before="0" w:lineRule="auto"/>
+            </w:pPr>
+            <w:r>
+              <w:rPr>
+                <w:rFonts w:ascii="Arial" w:cs="Times New Roman" w:eastAsia="Times New Roman" w:hAnsi="Arial"/>
+                <w:b/>
+                <w:bCs/>
+                <w:i w:val="false"/>
+                <w:iCs w:val="false"/>
+                <w:color w:val="293137"/>
+                <w:sz w:val="18"/>
                 <w:szCs w:val="22"/>
               </w:rPr>
               <w:t xml:space="preserve">{{ИНН_ПОДРЯДЧИКА}}</w:t>
             </w:r>
             <w:r>
               <w:rPr>
-                <w:rFonts w:ascii="Times New Roman" w:cs="Times New Roman" w:eastAsia="Times New Roman" w:hAnsi="Times New Roman"/>
-                <w:b w:val="false"/>
-                <w:bCs w:val="false"/>
-                <w:sz w:val="22"/>
+                <w:rFonts w:ascii="Arial" w:cs="Times New Roman" w:eastAsia="Times New Roman" w:hAnsi="Arial"/>
+                <w:b w:val="0"/>
+                <w:bCs w:val="false"/>
+                <w:color w:val="293137"/>
+                <w:sz w:val="18"/>
                 <w:szCs w:val="22"/>
               </w:rPr>
               <w:t xml:space="preserve">, </w:t>
             </w:r>
             <w:r>
               <w:rPr>
-                <w:rFonts w:ascii="Times New Roman" w:cs="Times New Roman" w:eastAsia="Times New Roman" w:hAnsi="Times New Roman"/>
-                <w:b/>
-                <w:bCs/>
-                <w:i w:val="false"/>
-                <w:iCs w:val="false"/>
-                <w:color w:val="000000"/>
-                <w:sz w:val="22"/>
+                <w:rFonts w:ascii="Arial" w:cs="Times New Roman" w:eastAsia="Times New Roman" w:hAnsi="Arial"/>
+                <w:b/>
+                <w:bCs/>
+                <w:i w:val="false"/>
+                <w:iCs w:val="false"/>
+                <w:color w:val="293137"/>
+                <w:sz w:val="18"/>
                 <w:szCs w:val="22"/>
               </w:rPr>
               <w:t xml:space="preserve">{{ОГРН_ПОДРЯДЧИКА}}</w:t>
@@ -490,17 +401,19 @@
               <w:bottom w:type="dxa" w:w="80"/>
               <w:right w:type="dxa" w:w="120"/>
             </w:tcMar>
-          </w:tcPr>
-          <w:p>
-            <w:pPr>
-              <w:spacing w:after="0" w:line="240"/>
-            </w:pPr>
-            <w:r>
-              <w:rPr>
-                <w:rFonts w:ascii="Times New Roman" w:cs="Times New Roman" w:eastAsia="Times New Roman" w:hAnsi="Times New Roman"/>
-                <w:b w:val="false"/>
-                <w:bCs w:val="false"/>
-                <w:sz w:val="22"/>
+            <w:shd w:fill="F4F5F5"/>
+          </w:tcPr>
+          <w:p>
+            <w:pPr>
+              <w:spacing w:after="40" w:line="262" w:before="0" w:lineRule="auto"/>
+            </w:pPr>
+            <w:r>
+              <w:rPr>
+                <w:rFonts w:ascii="Arial" w:cs="Times New Roman" w:eastAsia="Times New Roman" w:hAnsi="Arial"/>
+                <w:b w:val="0"/>
+                <w:bCs w:val="false"/>
+                <w:color w:val="293137"/>
+                <w:sz w:val="18"/>
                 <w:szCs w:val="22"/>
               </w:rPr>
               <w:t xml:space="preserve">ИНН и ОГРН вашей организации</w:t>
@@ -516,17 +429,19 @@
               <w:bottom w:type="dxa" w:w="80"/>
               <w:right w:type="dxa" w:w="120"/>
             </w:tcMar>
-          </w:tcPr>
-          <w:p>
-            <w:pPr>
-              <w:spacing w:after="0" w:line="240"/>
-            </w:pPr>
-            <w:r>
-              <w:rPr>
-                <w:rFonts w:ascii="Times New Roman" w:cs="Times New Roman" w:eastAsia="Times New Roman" w:hAnsi="Times New Roman"/>
-                <w:b w:val="false"/>
-                <w:bCs w:val="false"/>
-                <w:sz w:val="22"/>
+            <w:shd w:fill="F4F5F5"/>
+          </w:tcPr>
+          <w:p>
+            <w:pPr>
+              <w:spacing w:after="40" w:line="262" w:before="0" w:lineRule="auto"/>
+            </w:pPr>
+            <w:r>
+              <w:rPr>
+                <w:rFonts w:ascii="Arial" w:cs="Times New Roman" w:eastAsia="Times New Roman" w:hAnsi="Arial"/>
+                <w:b w:val="0"/>
+                <w:bCs w:val="false"/>
+                <w:color w:val="293137"/>
+                <w:sz w:val="18"/>
                 <w:szCs w:val="22"/>
               </w:rPr>
               <w:t xml:space="preserve">выписка ЕГРЮЛ</w:t>
@@ -547,17 +462,17 @@
           </w:tcPr>
           <w:p>
             <w:pPr>
-              <w:spacing w:after="0" w:line="240"/>
-            </w:pPr>
-            <w:r>
-              <w:rPr>
-                <w:rFonts w:ascii="Times New Roman" w:cs="Times New Roman" w:eastAsia="Times New Roman" w:hAnsi="Times New Roman"/>
-                <w:b/>
-                <w:bCs/>
-                <w:i w:val="false"/>
-                <w:iCs w:val="false"/>
-                <w:color w:val="000000"/>
-                <w:sz w:val="22"/>
+              <w:spacing w:after="40" w:line="262" w:before="0" w:lineRule="auto"/>
+            </w:pPr>
+            <w:r>
+              <w:rPr>
+                <w:rFonts w:ascii="Arial" w:cs="Times New Roman" w:eastAsia="Times New Roman" w:hAnsi="Arial"/>
+                <w:b/>
+                <w:bCs/>
+                <w:i w:val="false"/>
+                <w:iCs w:val="false"/>
+                <w:color w:val="293137"/>
+                <w:sz w:val="18"/>
                 <w:szCs w:val="22"/>
               </w:rPr>
               <w:t xml:space="preserve">{{АДРЕС_ПОДРЯДЧИКА}}</w:t>
@@ -576,14 +491,15 @@
           </w:tcPr>
           <w:p>
             <w:pPr>
-              <w:spacing w:after="0" w:line="240"/>
-            </w:pPr>
-            <w:r>
-              <w:rPr>
-                <w:rFonts w:ascii="Times New Roman" w:cs="Times New Roman" w:eastAsia="Times New Roman" w:hAnsi="Times New Roman"/>
-                <w:b w:val="false"/>
-                <w:bCs w:val="false"/>
-                <w:sz w:val="22"/>
+              <w:spacing w:after="40" w:line="262" w:before="0" w:lineRule="auto"/>
+            </w:pPr>
+            <w:r>
+              <w:rPr>
+                <w:rFonts w:ascii="Arial" w:cs="Times New Roman" w:eastAsia="Times New Roman" w:hAnsi="Arial"/>
+                <w:b w:val="0"/>
+                <w:bCs w:val="false"/>
+                <w:color w:val="293137"/>
+                <w:sz w:val="18"/>
                 <w:szCs w:val="22"/>
               </w:rPr>
               <w:t xml:space="preserve">Юридический адрес вашей организации</w:t>
@@ -602,14 +518,15 @@
           </w:tcPr>
           <w:p>
             <w:pPr>
-              <w:spacing w:after="0" w:line="240"/>
-            </w:pPr>
-            <w:r>
-              <w:rPr>
-                <w:rFonts w:ascii="Times New Roman" w:cs="Times New Roman" w:eastAsia="Times New Roman" w:hAnsi="Times New Roman"/>
-                <w:b w:val="false"/>
-                <w:bCs w:val="false"/>
-                <w:sz w:val="22"/>
+              <w:spacing w:after="40" w:line="262" w:before="0" w:lineRule="auto"/>
+            </w:pPr>
+            <w:r>
+              <w:rPr>
+                <w:rFonts w:ascii="Arial" w:cs="Times New Roman" w:eastAsia="Times New Roman" w:hAnsi="Arial"/>
+                <w:b w:val="0"/>
+                <w:bCs w:val="false"/>
+                <w:color w:val="293137"/>
+                <w:sz w:val="18"/>
                 <w:szCs w:val="22"/>
               </w:rPr>
               <w:t xml:space="preserve">выписка ЕГРЮЛ</w:t>
@@ -627,20 +544,21 @@
               <w:bottom w:type="dxa" w:w="80"/>
               <w:right w:type="dxa" w:w="120"/>
             </w:tcMar>
-          </w:tcPr>
-          <w:p>
-            <w:pPr>
-              <w:spacing w:after="0" w:line="240"/>
-            </w:pPr>
-            <w:r>
-              <w:rPr>
-                <w:rFonts w:ascii="Times New Roman" w:cs="Times New Roman" w:eastAsia="Times New Roman" w:hAnsi="Times New Roman"/>
-                <w:b/>
-                <w:bCs/>
-                <w:i w:val="false"/>
-                <w:iCs w:val="false"/>
-                <w:color w:val="000000"/>
-                <w:sz w:val="22"/>
+            <w:shd w:fill="F4F5F5"/>
+          </w:tcPr>
+          <w:p>
+            <w:pPr>
+              <w:spacing w:after="40" w:line="262" w:before="0" w:lineRule="auto"/>
+            </w:pPr>
+            <w:r>
+              <w:rPr>
+                <w:rFonts w:ascii="Arial" w:cs="Times New Roman" w:eastAsia="Times New Roman" w:hAnsi="Arial"/>
+                <w:b/>
+                <w:bCs/>
+                <w:i w:val="false"/>
+                <w:iCs w:val="false"/>
+                <w:color w:val="293137"/>
+                <w:sz w:val="18"/>
                 <w:szCs w:val="22"/>
               </w:rPr>
               <w:t xml:space="preserve">{{КОНТАКТЫ_ПОДРЯДЧИКА}}</w:t>
@@ -656,20 +574,22 @@
               <w:bottom w:type="dxa" w:w="80"/>
               <w:right w:type="dxa" w:w="120"/>
             </w:tcMar>
-          </w:tcPr>
-          <w:p>
-            <w:pPr>
-              <w:spacing w:after="0" w:line="240"/>
-            </w:pPr>
-            <w:r>
-              <w:rPr>
-                <w:rFonts w:ascii="Times New Roman" w:cs="Times New Roman" w:eastAsia="Times New Roman" w:hAnsi="Times New Roman"/>
-                <w:b w:val="false"/>
-                <w:bCs w:val="false"/>
-                <w:sz w:val="22"/>
-                <w:szCs w:val="22"/>
-              </w:rPr>
-              <w:t xml:space="preserve">Телефон и адрес электронной почты для суда</w:t>
+            <w:shd w:fill="F4F5F5"/>
+          </w:tcPr>
+          <w:p>
+            <w:pPr>
+              <w:spacing w:after="40" w:line="262" w:before="0" w:lineRule="auto"/>
+            </w:pPr>
+            <w:r>
+              <w:rPr>
+                <w:rFonts w:ascii="Arial" w:cs="Times New Roman" w:eastAsia="Times New Roman" w:hAnsi="Arial"/>
+                <w:b w:val="0"/>
+                <w:bCs w:val="false"/>
+                <w:color w:val="293137"/>
+                <w:sz w:val="18"/>
+                <w:szCs w:val="22"/>
+              </w:rPr>
+              <w:t xml:space="preserve">Телефон и адрес электронной почты для связи по передаче документации</w:t>
             </w:r>
           </w:p>
         </w:tc>
@@ -682,17 +602,19 @@
               <w:bottom w:type="dxa" w:w="80"/>
               <w:right w:type="dxa" w:w="120"/>
             </w:tcMar>
-          </w:tcPr>
-          <w:p>
-            <w:pPr>
-              <w:spacing w:after="0" w:line="240"/>
-            </w:pPr>
-            <w:r>
-              <w:rPr>
-                <w:rFonts w:ascii="Times New Roman" w:cs="Times New Roman" w:eastAsia="Times New Roman" w:hAnsi="Times New Roman"/>
-                <w:b w:val="false"/>
-                <w:bCs w:val="false"/>
-                <w:sz w:val="22"/>
+            <w:shd w:fill="F4F5F5"/>
+          </w:tcPr>
+          <w:p>
+            <w:pPr>
+              <w:spacing w:after="40" w:line="262" w:before="0" w:lineRule="auto"/>
+            </w:pPr>
+            <w:r>
+              <w:rPr>
+                <w:rFonts w:ascii="Arial" w:cs="Times New Roman" w:eastAsia="Times New Roman" w:hAnsi="Arial"/>
+                <w:b w:val="0"/>
+                <w:bCs w:val="false"/>
+                <w:color w:val="293137"/>
+                <w:sz w:val="18"/>
                 <w:szCs w:val="22"/>
               </w:rPr>
               <w:t xml:space="preserve">ваши рабочие контакты</w:t>
@@ -713,17 +635,17 @@
           </w:tcPr>
           <w:p>
             <w:pPr>
-              <w:spacing w:after="0" w:line="240"/>
-            </w:pPr>
-            <w:r>
-              <w:rPr>
-                <w:rFonts w:ascii="Times New Roman" w:cs="Times New Roman" w:eastAsia="Times New Roman" w:hAnsi="Times New Roman"/>
-                <w:b/>
-                <w:bCs/>
-                <w:i w:val="false"/>
-                <w:iCs w:val="false"/>
-                <w:color w:val="000000"/>
-                <w:sz w:val="22"/>
+              <w:spacing w:after="40" w:line="262" w:before="0" w:lineRule="auto"/>
+            </w:pPr>
+            <w:r>
+              <w:rPr>
+                <w:rFonts w:ascii="Arial" w:cs="Times New Roman" w:eastAsia="Times New Roman" w:hAnsi="Arial"/>
+                <w:b/>
+                <w:bCs/>
+                <w:i w:val="false"/>
+                <w:iCs w:val="false"/>
+                <w:color w:val="293137"/>
+                <w:sz w:val="18"/>
                 <w:szCs w:val="22"/>
               </w:rPr>
               <w:t xml:space="preserve">{{БАНКОВСКИЕ_РЕКВИЗИТЫ_ПОДРЯДЧИКА}}</w:t>
@@ -742,14 +664,15 @@
           </w:tcPr>
           <w:p>
             <w:pPr>
-              <w:spacing w:after="0" w:line="240"/>
-            </w:pPr>
-            <w:r>
-              <w:rPr>
-                <w:rFonts w:ascii="Times New Roman" w:cs="Times New Roman" w:eastAsia="Times New Roman" w:hAnsi="Times New Roman"/>
-                <w:b w:val="false"/>
-                <w:bCs w:val="false"/>
-                <w:sz w:val="22"/>
+              <w:spacing w:after="40" w:line="262" w:before="0" w:lineRule="auto"/>
+            </w:pPr>
+            <w:r>
+              <w:rPr>
+                <w:rFonts w:ascii="Arial" w:cs="Times New Roman" w:eastAsia="Times New Roman" w:hAnsi="Arial"/>
+                <w:b w:val="0"/>
+                <w:bCs w:val="false"/>
+                <w:color w:val="293137"/>
+                <w:sz w:val="18"/>
                 <w:szCs w:val="22"/>
               </w:rPr>
               <w:t xml:space="preserve">Расчётный счёт, банк, БИК, корсчёт</w:t>
@@ -768,14 +691,15 @@
           </w:tcPr>
           <w:p>
             <w:pPr>
-              <w:spacing w:after="0" w:line="240"/>
-            </w:pPr>
-            <w:r>
-              <w:rPr>
-                <w:rFonts w:ascii="Times New Roman" w:cs="Times New Roman" w:eastAsia="Times New Roman" w:hAnsi="Times New Roman"/>
-                <w:b w:val="false"/>
-                <w:bCs w:val="false"/>
-                <w:sz w:val="22"/>
+              <w:spacing w:after="40" w:line="262" w:before="0" w:lineRule="auto"/>
+            </w:pPr>
+            <w:r>
+              <w:rPr>
+                <w:rFonts w:ascii="Arial" w:cs="Times New Roman" w:eastAsia="Times New Roman" w:hAnsi="Arial"/>
+                <w:b w:val="0"/>
+                <w:bCs w:val="false"/>
+                <w:color w:val="293137"/>
+                <w:sz w:val="18"/>
                 <w:szCs w:val="22"/>
               </w:rPr>
               <w:t xml:space="preserve">справка банка</w:t>
@@ -793,20 +717,21 @@
               <w:bottom w:type="dxa" w:w="80"/>
               <w:right w:type="dxa" w:w="120"/>
             </w:tcMar>
-          </w:tcPr>
-          <w:p>
-            <w:pPr>
-              <w:spacing w:after="0" w:line="240"/>
-            </w:pPr>
-            <w:r>
-              <w:rPr>
-                <w:rFonts w:ascii="Times New Roman" w:cs="Times New Roman" w:eastAsia="Times New Roman" w:hAnsi="Times New Roman"/>
-                <w:b/>
-                <w:bCs/>
-                <w:i w:val="false"/>
-                <w:iCs w:val="false"/>
-                <w:color w:val="000000"/>
-                <w:sz w:val="22"/>
+            <w:shd w:fill="F4F5F5"/>
+          </w:tcPr>
+          <w:p>
+            <w:pPr>
+              <w:spacing w:after="40" w:line="262" w:before="0" w:lineRule="auto"/>
+            </w:pPr>
+            <w:r>
+              <w:rPr>
+                <w:rFonts w:ascii="Arial" w:cs="Times New Roman" w:eastAsia="Times New Roman" w:hAnsi="Arial"/>
+                <w:b/>
+                <w:bCs/>
+                <w:i w:val="false"/>
+                <w:iCs w:val="false"/>
+                <w:color w:val="293137"/>
+                <w:sz w:val="18"/>
                 <w:szCs w:val="22"/>
               </w:rPr>
               <w:t xml:space="preserve">{{НАИМЕНОВАНИЕ_ЗАКАЗЧИКА}}</w:t>
@@ -822,20 +747,22 @@
               <w:bottom w:type="dxa" w:w="80"/>
               <w:right w:type="dxa" w:w="120"/>
             </w:tcMar>
-          </w:tcPr>
-          <w:p>
-            <w:pPr>
-              <w:spacing w:after="0" w:line="240"/>
-            </w:pPr>
-            <w:r>
-              <w:rPr>
-                <w:rFonts w:ascii="Times New Roman" w:cs="Times New Roman" w:eastAsia="Times New Roman" w:hAnsi="Times New Roman"/>
-                <w:b w:val="false"/>
-                <w:bCs w:val="false"/>
-                <w:sz w:val="22"/>
-                <w:szCs w:val="22"/>
-              </w:rPr>
-              <w:t xml:space="preserve">Полное наименование должника — стороны договора, обязанной платить</w:t>
+            <w:shd w:fill="F4F5F5"/>
+          </w:tcPr>
+          <w:p>
+            <w:pPr>
+              <w:spacing w:after="40" w:line="262" w:before="0" w:lineRule="auto"/>
+            </w:pPr>
+            <w:r>
+              <w:rPr>
+                <w:rFonts w:ascii="Arial" w:cs="Times New Roman" w:eastAsia="Times New Roman" w:hAnsi="Arial"/>
+                <w:b w:val="0"/>
+                <w:bCs w:val="false"/>
+                <w:color w:val="293137"/>
+                <w:sz w:val="18"/>
+                <w:szCs w:val="22"/>
+              </w:rPr>
+              <w:t xml:space="preserve">Полное наименование Заказчика по договору</w:t>
             </w:r>
           </w:p>
         </w:tc>
@@ -848,17 +775,19 @@
               <w:bottom w:type="dxa" w:w="80"/>
               <w:right w:type="dxa" w:w="120"/>
             </w:tcMar>
-          </w:tcPr>
-          <w:p>
-            <w:pPr>
-              <w:spacing w:after="0" w:line="240"/>
-            </w:pPr>
-            <w:r>
-              <w:rPr>
-                <w:rFonts w:ascii="Times New Roman" w:cs="Times New Roman" w:eastAsia="Times New Roman" w:hAnsi="Times New Roman"/>
-                <w:b w:val="false"/>
-                <w:bCs w:val="false"/>
-                <w:sz w:val="22"/>
+            <w:shd w:fill="F4F5F5"/>
+          </w:tcPr>
+          <w:p>
+            <w:pPr>
+              <w:spacing w:after="40" w:line="262" w:before="0" w:lineRule="auto"/>
+            </w:pPr>
+            <w:r>
+              <w:rPr>
+                <w:rFonts w:ascii="Arial" w:cs="Times New Roman" w:eastAsia="Times New Roman" w:hAnsi="Arial"/>
+                <w:b w:val="0"/>
+                <w:bCs w:val="false"/>
+                <w:color w:val="293137"/>
+                <w:sz w:val="18"/>
                 <w:szCs w:val="22"/>
               </w:rPr>
               <w:t xml:space="preserve">договор и актуальная выписка ЕГРЮЛ</w:t>
@@ -879,40 +808,41 @@
           </w:tcPr>
           <w:p>
             <w:pPr>
-              <w:spacing w:after="0" w:line="240"/>
-            </w:pPr>
-            <w:r>
-              <w:rPr>
-                <w:rFonts w:ascii="Times New Roman" w:cs="Times New Roman" w:eastAsia="Times New Roman" w:hAnsi="Times New Roman"/>
-                <w:b/>
-                <w:bCs/>
-                <w:i w:val="false"/>
-                <w:iCs w:val="false"/>
-                <w:color w:val="000000"/>
-                <w:sz w:val="22"/>
+              <w:spacing w:after="40" w:line="262" w:before="0" w:lineRule="auto"/>
+            </w:pPr>
+            <w:r>
+              <w:rPr>
+                <w:rFonts w:ascii="Arial" w:cs="Times New Roman" w:eastAsia="Times New Roman" w:hAnsi="Arial"/>
+                <w:b/>
+                <w:bCs/>
+                <w:i w:val="false"/>
+                <w:iCs w:val="false"/>
+                <w:color w:val="293137"/>
+                <w:sz w:val="18"/>
                 <w:szCs w:val="22"/>
               </w:rPr>
               <w:t xml:space="preserve">{{ИНН_ЗАКАЗЧИКА}}</w:t>
             </w:r>
             <w:r>
               <w:rPr>
-                <w:rFonts w:ascii="Times New Roman" w:cs="Times New Roman" w:eastAsia="Times New Roman" w:hAnsi="Times New Roman"/>
-                <w:b w:val="false"/>
-                <w:bCs w:val="false"/>
-                <w:sz w:val="22"/>
+                <w:rFonts w:ascii="Arial" w:cs="Times New Roman" w:eastAsia="Times New Roman" w:hAnsi="Arial"/>
+                <w:b w:val="0"/>
+                <w:bCs w:val="false"/>
+                <w:color w:val="293137"/>
+                <w:sz w:val="18"/>
                 <w:szCs w:val="22"/>
               </w:rPr>
               <w:t xml:space="preserve">, </w:t>
             </w:r>
             <w:r>
               <w:rPr>
-                <w:rFonts w:ascii="Times New Roman" w:cs="Times New Roman" w:eastAsia="Times New Roman" w:hAnsi="Times New Roman"/>
-                <w:b/>
-                <w:bCs/>
-                <w:i w:val="false"/>
-                <w:iCs w:val="false"/>
-                <w:color w:val="000000"/>
-                <w:sz w:val="22"/>
+                <w:rFonts w:ascii="Arial" w:cs="Times New Roman" w:eastAsia="Times New Roman" w:hAnsi="Arial"/>
+                <w:b/>
+                <w:bCs/>
+                <w:i w:val="false"/>
+                <w:iCs w:val="false"/>
+                <w:color w:val="293137"/>
+                <w:sz w:val="18"/>
                 <w:szCs w:val="22"/>
               </w:rPr>
               <w:t xml:space="preserve">{{ОГРН_ЗАКАЗЧИКА}}</w:t>
@@ -931,17 +861,18 @@
           </w:tcPr>
           <w:p>
             <w:pPr>
-              <w:spacing w:after="0" w:line="240"/>
-            </w:pPr>
-            <w:r>
-              <w:rPr>
-                <w:rFonts w:ascii="Times New Roman" w:cs="Times New Roman" w:eastAsia="Times New Roman" w:hAnsi="Times New Roman"/>
-                <w:b w:val="false"/>
-                <w:bCs w:val="false"/>
-                <w:sz w:val="22"/>
-                <w:szCs w:val="22"/>
-              </w:rPr>
-              <w:t xml:space="preserve">ИНН и ОГРН должника</w:t>
+              <w:spacing w:after="40" w:line="262" w:before="0" w:lineRule="auto"/>
+            </w:pPr>
+            <w:r>
+              <w:rPr>
+                <w:rFonts w:ascii="Arial" w:cs="Times New Roman" w:eastAsia="Times New Roman" w:hAnsi="Arial"/>
+                <w:b w:val="0"/>
+                <w:bCs w:val="false"/>
+                <w:color w:val="293137"/>
+                <w:sz w:val="18"/>
+                <w:szCs w:val="22"/>
+              </w:rPr>
+              <w:t xml:space="preserve">ИНН и ОГРН Заказчика</w:t>
             </w:r>
           </w:p>
         </w:tc>
@@ -957,17 +888,18 @@
           </w:tcPr>
           <w:p>
             <w:pPr>
-              <w:spacing w:after="0" w:line="240"/>
-            </w:pPr>
-            <w:r>
-              <w:rPr>
-                <w:rFonts w:ascii="Times New Roman" w:cs="Times New Roman" w:eastAsia="Times New Roman" w:hAnsi="Times New Roman"/>
-                <w:b w:val="false"/>
-                <w:bCs w:val="false"/>
-                <w:sz w:val="22"/>
-                <w:szCs w:val="22"/>
-              </w:rPr>
-              <w:t xml:space="preserve">выписка ЕГРЮЛ; для иска они обязательны (ст. 125 АПК РФ)</w:t>
+              <w:spacing w:after="40" w:line="262" w:before="0" w:lineRule="auto"/>
+            </w:pPr>
+            <w:r>
+              <w:rPr>
+                <w:rFonts w:ascii="Arial" w:cs="Times New Roman" w:eastAsia="Times New Roman" w:hAnsi="Arial"/>
+                <w:b w:val="0"/>
+                <w:bCs w:val="false"/>
+                <w:color w:val="293137"/>
+                <w:sz w:val="18"/>
+                <w:szCs w:val="22"/>
+              </w:rPr>
+              <w:t xml:space="preserve">актуальная выписка ЕГРЮЛ</w:t>
             </w:r>
           </w:p>
         </w:tc>
@@ -982,20 +914,21 @@
               <w:bottom w:type="dxa" w:w="80"/>
               <w:right w:type="dxa" w:w="120"/>
             </w:tcMar>
-          </w:tcPr>
-          <w:p>
-            <w:pPr>
-              <w:spacing w:after="0" w:line="240"/>
-            </w:pPr>
-            <w:r>
-              <w:rPr>
-                <w:rFonts w:ascii="Times New Roman" w:cs="Times New Roman" w:eastAsia="Times New Roman" w:hAnsi="Times New Roman"/>
-                <w:b/>
-                <w:bCs/>
-                <w:i w:val="false"/>
-                <w:iCs w:val="false"/>
-                <w:color w:val="000000"/>
-                <w:sz w:val="22"/>
+            <w:shd w:fill="F4F5F5"/>
+          </w:tcPr>
+          <w:p>
+            <w:pPr>
+              <w:spacing w:after="40" w:line="262" w:before="0" w:lineRule="auto"/>
+            </w:pPr>
+            <w:r>
+              <w:rPr>
+                <w:rFonts w:ascii="Arial" w:cs="Times New Roman" w:eastAsia="Times New Roman" w:hAnsi="Arial"/>
+                <w:b/>
+                <w:bCs/>
+                <w:i w:val="false"/>
+                <w:iCs w:val="false"/>
+                <w:color w:val="293137"/>
+                <w:sz w:val="18"/>
                 <w:szCs w:val="22"/>
               </w:rPr>
               <w:t xml:space="preserve">{{АДРЕС_ЗАКАЗЧИКА}}</w:t>
@@ -1011,20 +944,22 @@
               <w:bottom w:type="dxa" w:w="80"/>
               <w:right w:type="dxa" w:w="120"/>
             </w:tcMar>
-          </w:tcPr>
-          <w:p>
-            <w:pPr>
-              <w:spacing w:after="0" w:line="240"/>
-            </w:pPr>
-            <w:r>
-              <w:rPr>
-                <w:rFonts w:ascii="Times New Roman" w:cs="Times New Roman" w:eastAsia="Times New Roman" w:hAnsi="Times New Roman"/>
-                <w:b w:val="false"/>
-                <w:bCs w:val="false"/>
-                <w:sz w:val="22"/>
-                <w:szCs w:val="22"/>
-              </w:rPr>
-              <w:t xml:space="preserve">Юридический адрес должника</w:t>
+            <w:shd w:fill="F4F5F5"/>
+          </w:tcPr>
+          <w:p>
+            <w:pPr>
+              <w:spacing w:after="40" w:line="262" w:before="0" w:lineRule="auto"/>
+            </w:pPr>
+            <w:r>
+              <w:rPr>
+                <w:rFonts w:ascii="Arial" w:cs="Times New Roman" w:eastAsia="Times New Roman" w:hAnsi="Arial"/>
+                <w:b w:val="0"/>
+                <w:bCs w:val="false"/>
+                <w:color w:val="293137"/>
+                <w:sz w:val="18"/>
+                <w:szCs w:val="22"/>
+              </w:rPr>
+              <w:t xml:space="preserve">Юридический адрес Заказчика</w:t>
             </w:r>
           </w:p>
         </w:tc>
@@ -1037,20 +972,22 @@
               <w:bottom w:type="dxa" w:w="80"/>
               <w:right w:type="dxa" w:w="120"/>
             </w:tcMar>
-          </w:tcPr>
-          <w:p>
-            <w:pPr>
-              <w:spacing w:after="0" w:line="240"/>
-            </w:pPr>
-            <w:r>
-              <w:rPr>
-                <w:rFonts w:ascii="Times New Roman" w:cs="Times New Roman" w:eastAsia="Times New Roman" w:hAnsi="Times New Roman"/>
-                <w:b w:val="false"/>
-                <w:bCs w:val="false"/>
-                <w:sz w:val="22"/>
-                <w:szCs w:val="22"/>
-              </w:rPr>
-              <w:t xml:space="preserve">свежая выписка ЕГРЮЛ, а не шапка договора: адрес мог смениться</w:t>
+            <w:shd w:fill="F4F5F5"/>
+          </w:tcPr>
+          <w:p>
+            <w:pPr>
+              <w:spacing w:after="40" w:line="262" w:before="0" w:lineRule="auto"/>
+            </w:pPr>
+            <w:r>
+              <w:rPr>
+                <w:rFonts w:ascii="Arial" w:cs="Times New Roman" w:eastAsia="Times New Roman" w:hAnsi="Arial"/>
+                <w:b w:val="0"/>
+                <w:bCs w:val="false"/>
+                <w:color w:val="293137"/>
+                <w:sz w:val="18"/>
+                <w:szCs w:val="22"/>
+              </w:rPr>
+              <w:t xml:space="preserve">актуальная выписка ЕГРЮЛ</w:t>
             </w:r>
           </w:p>
         </w:tc>
@@ -1068,40 +1005,41 @@
           </w:tcPr>
           <w:p>
             <w:pPr>
-              <w:spacing w:after="0" w:line="240"/>
-            </w:pPr>
-            <w:r>
-              <w:rPr>
-                <w:rFonts w:ascii="Times New Roman" w:cs="Times New Roman" w:eastAsia="Times New Roman" w:hAnsi="Times New Roman"/>
-                <w:b/>
-                <w:bCs/>
-                <w:i w:val="false"/>
-                <w:iCs w:val="false"/>
-                <w:color w:val="000000"/>
-                <w:sz w:val="22"/>
+              <w:spacing w:after="40" w:line="262" w:before="0" w:lineRule="auto"/>
+            </w:pPr>
+            <w:r>
+              <w:rPr>
+                <w:rFonts w:ascii="Arial" w:cs="Times New Roman" w:eastAsia="Times New Roman" w:hAnsi="Arial"/>
+                <w:b/>
+                <w:bCs/>
+                <w:i w:val="false"/>
+                <w:iCs w:val="false"/>
+                <w:color w:val="293137"/>
+                <w:sz w:val="18"/>
                 <w:szCs w:val="22"/>
               </w:rPr>
               <w:t xml:space="preserve">{{ДОЛЖНОСТЬ_ПОДПИСАНТА}}</w:t>
             </w:r>
             <w:r>
               <w:rPr>
-                <w:rFonts w:ascii="Times New Roman" w:cs="Times New Roman" w:eastAsia="Times New Roman" w:hAnsi="Times New Roman"/>
-                <w:b w:val="false"/>
-                <w:bCs w:val="false"/>
-                <w:sz w:val="22"/>
+                <w:rFonts w:ascii="Arial" w:cs="Times New Roman" w:eastAsia="Times New Roman" w:hAnsi="Arial"/>
+                <w:b w:val="0"/>
+                <w:bCs w:val="false"/>
+                <w:color w:val="293137"/>
+                <w:sz w:val="18"/>
                 <w:szCs w:val="22"/>
               </w:rPr>
               <w:t xml:space="preserve">, </w:t>
             </w:r>
             <w:r>
               <w:rPr>
-                <w:rFonts w:ascii="Times New Roman" w:cs="Times New Roman" w:eastAsia="Times New Roman" w:hAnsi="Times New Roman"/>
-                <w:b/>
-                <w:bCs/>
-                <w:i w:val="false"/>
-                <w:iCs w:val="false"/>
-                <w:color w:val="000000"/>
-                <w:sz w:val="22"/>
+                <w:rFonts w:ascii="Arial" w:cs="Times New Roman" w:eastAsia="Times New Roman" w:hAnsi="Arial"/>
+                <w:b/>
+                <w:bCs/>
+                <w:i w:val="false"/>
+                <w:iCs w:val="false"/>
+                <w:color w:val="293137"/>
+                <w:sz w:val="18"/>
                 <w:szCs w:val="22"/>
               </w:rPr>
               <w:t xml:space="preserve">{{ФИО_ПОДПИСАНТА}}</w:t>
@@ -1120,14 +1058,15 @@
           </w:tcPr>
           <w:p>
             <w:pPr>
-              <w:spacing w:after="0" w:line="240"/>
-            </w:pPr>
-            <w:r>
-              <w:rPr>
-                <w:rFonts w:ascii="Times New Roman" w:cs="Times New Roman" w:eastAsia="Times New Roman" w:hAnsi="Times New Roman"/>
-                <w:b w:val="false"/>
-                <w:bCs w:val="false"/>
-                <w:sz w:val="22"/>
+              <w:spacing w:after="40" w:line="262" w:before="0" w:lineRule="auto"/>
+            </w:pPr>
+            <w:r>
+              <w:rPr>
+                <w:rFonts w:ascii="Arial" w:cs="Times New Roman" w:eastAsia="Times New Roman" w:hAnsi="Arial"/>
+                <w:b w:val="0"/>
+                <w:bCs w:val="false"/>
+                <w:color w:val="293137"/>
+                <w:sz w:val="18"/>
                 <w:szCs w:val="22"/>
               </w:rPr>
               <w:t xml:space="preserve">Кто подписывает от вашей организации</w:t>
@@ -1146,14 +1085,15 @@
           </w:tcPr>
           <w:p>
             <w:pPr>
-              <w:spacing w:after="0" w:line="240"/>
-            </w:pPr>
-            <w:r>
-              <w:rPr>
-                <w:rFonts w:ascii="Times New Roman" w:cs="Times New Roman" w:eastAsia="Times New Roman" w:hAnsi="Times New Roman"/>
-                <w:b w:val="false"/>
-                <w:bCs w:val="false"/>
-                <w:sz w:val="22"/>
+              <w:spacing w:after="40" w:line="262" w:before="0" w:lineRule="auto"/>
+            </w:pPr>
+            <w:r>
+              <w:rPr>
+                <w:rFonts w:ascii="Arial" w:cs="Times New Roman" w:eastAsia="Times New Roman" w:hAnsi="Arial"/>
+                <w:b w:val="0"/>
+                <w:bCs w:val="false"/>
+                <w:color w:val="293137"/>
+                <w:sz w:val="18"/>
                 <w:szCs w:val="22"/>
               </w:rPr>
               <w:t xml:space="preserve">устав, доверенность</w:t>
@@ -1171,20 +1111,21 @@
               <w:bottom w:type="dxa" w:w="80"/>
               <w:right w:type="dxa" w:w="120"/>
             </w:tcMar>
-          </w:tcPr>
-          <w:p>
-            <w:pPr>
-              <w:spacing w:after="0" w:line="240"/>
-            </w:pPr>
-            <w:r>
-              <w:rPr>
-                <w:rFonts w:ascii="Times New Roman" w:cs="Times New Roman" w:eastAsia="Times New Roman" w:hAnsi="Times New Roman"/>
-                <w:b/>
-                <w:bCs/>
-                <w:i w:val="false"/>
-                <w:iCs w:val="false"/>
-                <w:color w:val="000000"/>
-                <w:sz w:val="22"/>
+            <w:shd w:fill="F4F5F5"/>
+          </w:tcPr>
+          <w:p>
+            <w:pPr>
+              <w:spacing w:after="40" w:line="262" w:before="0" w:lineRule="auto"/>
+            </w:pPr>
+            <w:r>
+              <w:rPr>
+                <w:rFonts w:ascii="Arial" w:cs="Times New Roman" w:eastAsia="Times New Roman" w:hAnsi="Arial"/>
+                <w:b/>
+                <w:bCs/>
+                <w:i w:val="false"/>
+                <w:iCs w:val="false"/>
+                <w:color w:val="293137"/>
+                <w:sz w:val="18"/>
                 <w:szCs w:val="22"/>
               </w:rPr>
               <w:t xml:space="preserve">{{ОСНОВАНИЕ_ПОЛНОМОЧИЙ}}</w:t>
@@ -1200,20 +1141,22 @@
               <w:bottom w:type="dxa" w:w="80"/>
               <w:right w:type="dxa" w:w="120"/>
             </w:tcMar>
-          </w:tcPr>
-          <w:p>
-            <w:pPr>
-              <w:spacing w:after="0" w:line="240"/>
-            </w:pPr>
-            <w:r>
-              <w:rPr>
-                <w:rFonts w:ascii="Times New Roman" w:cs="Times New Roman" w:eastAsia="Times New Roman" w:hAnsi="Times New Roman"/>
-                <w:b w:val="false"/>
-                <w:bCs w:val="false"/>
-                <w:sz w:val="22"/>
-                <w:szCs w:val="22"/>
-              </w:rPr>
-              <w:t xml:space="preserve">«действующего на основании Устава» либо реквизиты доверенности</w:t>
+            <w:shd w:fill="F4F5F5"/>
+          </w:tcPr>
+          <w:p>
+            <w:pPr>
+              <w:spacing w:after="40" w:line="262" w:before="0" w:lineRule="auto"/>
+            </w:pPr>
+            <w:r>
+              <w:rPr>
+                <w:rFonts w:ascii="Arial" w:cs="Times New Roman" w:eastAsia="Times New Roman" w:hAnsi="Arial"/>
+                <w:b w:val="0"/>
+                <w:bCs w:val="false"/>
+                <w:color w:val="293137"/>
+                <w:sz w:val="18"/>
+                <w:szCs w:val="22"/>
+              </w:rPr>
+              <w:t xml:space="preserve">«Устава» либо «доверенности № … от …»</w:t>
             </w:r>
           </w:p>
         </w:tc>
@@ -1226,17 +1169,19 @@
               <w:bottom w:type="dxa" w:w="80"/>
               <w:right w:type="dxa" w:w="120"/>
             </w:tcMar>
-          </w:tcPr>
-          <w:p>
-            <w:pPr>
-              <w:spacing w:after="0" w:line="240"/>
-            </w:pPr>
-            <w:r>
-              <w:rPr>
-                <w:rFonts w:ascii="Times New Roman" w:cs="Times New Roman" w:eastAsia="Times New Roman" w:hAnsi="Times New Roman"/>
-                <w:b w:val="false"/>
-                <w:bCs w:val="false"/>
-                <w:sz w:val="22"/>
+            <w:shd w:fill="F4F5F5"/>
+          </w:tcPr>
+          <w:p>
+            <w:pPr>
+              <w:spacing w:after="40" w:line="262" w:before="0" w:lineRule="auto"/>
+            </w:pPr>
+            <w:r>
+              <w:rPr>
+                <w:rFonts w:ascii="Arial" w:cs="Times New Roman" w:eastAsia="Times New Roman" w:hAnsi="Arial"/>
+                <w:b w:val="0"/>
+                <w:bCs w:val="false"/>
+                <w:color w:val="293137"/>
+                <w:sz w:val="18"/>
                 <w:szCs w:val="22"/>
               </w:rPr>
               <w:t xml:space="preserve">устав, доверенность</w:t>
@@ -1247,21 +1192,22 @@
     </w:tbl>
     <w:p>
       <w:pPr>
-        <w:spacing w:after="120" w:line="276"/>
+        <w:spacing w:after="80" w:line="269" w:before="0" w:lineRule="auto"/>
       </w:pPr>
     </w:p>
     <w:p>
       <w:pPr>
         <w:pStyle w:val="Heading2"/>
         <w:keepNext/>
-        <w:spacing w:after="120" w:before="260"/>
+        <w:spacing w:after="120" w:before="160" w:line="269" w:lineRule="auto"/>
       </w:pPr>
       <w:r>
         <w:rPr>
-          <w:rFonts w:ascii="Times New Roman" w:cs="Times New Roman" w:eastAsia="Times New Roman" w:hAnsi="Times New Roman"/>
+          <w:rFonts w:ascii="Arial" w:cs="Times New Roman" w:eastAsia="Times New Roman" w:hAnsi="Arial"/>
           <w:b/>
           <w:bCs/>
-          <w:sz w:val="26"/>
+          <w:color w:val="A9803D"/>
+          <w:sz w:val="22"/>
           <w:szCs w:val="26"/>
         </w:rPr>
         <w:t xml:space="preserve">Поля комплекта</w:t>
@@ -1278,6 +1224,7 @@
           <w:insideH w:val="single" w:color="auto" w:sz="4"/>
           <w:insideV w:val="single" w:color="auto" w:sz="4"/>
         </w:tblBorders>
+        <w:tblLayout w:type="autofit"/>
       </w:tblPr>
       <w:tblGrid>
         <w:gridCol w:w="3200"/>
@@ -1287,28 +1234,30 @@
       <w:tr>
         <w:trPr>
           <w:tblHeader/>
+          <w:tblHeader/>
         </w:trPr>
         <w:tc>
           <w:tcPr>
             <w:tcW w:type="dxa" w:w="3200"/>
-            <w:shd w:fill="EDEDED" w:val="clear"/>
-            <w:tcMar>
-              <w:top w:type="dxa" w:w="80"/>
-              <w:left w:type="dxa" w:w="120"/>
-              <w:bottom w:type="dxa" w:w="80"/>
-              <w:right w:type="dxa" w:w="120"/>
-            </w:tcMar>
-          </w:tcPr>
-          <w:p>
-            <w:pPr>
-              <w:spacing w:after="0" w:line="240"/>
-            </w:pPr>
-            <w:r>
-              <w:rPr>
-                <w:rFonts w:ascii="Times New Roman" w:cs="Times New Roman" w:eastAsia="Times New Roman" w:hAnsi="Times New Roman"/>
-                <w:b/>
-                <w:bCs/>
-                <w:sz w:val="22"/>
+            <w:shd w:fill="303941" w:val="clear"/>
+            <w:tcMar>
+              <w:top w:type="dxa" w:w="80"/>
+              <w:left w:type="dxa" w:w="120"/>
+              <w:bottom w:type="dxa" w:w="80"/>
+              <w:right w:type="dxa" w:w="120"/>
+            </w:tcMar>
+          </w:tcPr>
+          <w:p>
+            <w:pPr>
+              <w:spacing w:after="40" w:line="262" w:before="0" w:lineRule="auto"/>
+            </w:pPr>
+            <w:r>
+              <w:rPr>
+                <w:rFonts w:ascii="Arial" w:cs="Times New Roman" w:eastAsia="Times New Roman" w:hAnsi="Arial"/>
+                <w:b/>
+                <w:bCs/>
+                <w:color w:val="FFFFFF"/>
+                <w:sz w:val="18"/>
                 <w:szCs w:val="22"/>
               </w:rPr>
               <w:t xml:space="preserve">Поле</w:t>
@@ -1318,24 +1267,25 @@
         <w:tc>
           <w:tcPr>
             <w:tcW w:type="dxa" w:w="3300"/>
-            <w:shd w:fill="EDEDED" w:val="clear"/>
-            <w:tcMar>
-              <w:top w:type="dxa" w:w="80"/>
-              <w:left w:type="dxa" w:w="120"/>
-              <w:bottom w:type="dxa" w:w="80"/>
-              <w:right w:type="dxa" w:w="120"/>
-            </w:tcMar>
-          </w:tcPr>
-          <w:p>
-            <w:pPr>
-              <w:spacing w:after="0" w:line="240"/>
-            </w:pPr>
-            <w:r>
-              <w:rPr>
-                <w:rFonts w:ascii="Times New Roman" w:cs="Times New Roman" w:eastAsia="Times New Roman" w:hAnsi="Times New Roman"/>
-                <w:b/>
-                <w:bCs/>
-                <w:sz w:val="22"/>
+            <w:shd w:fill="303941" w:val="clear"/>
+            <w:tcMar>
+              <w:top w:type="dxa" w:w="80"/>
+              <w:left w:type="dxa" w:w="120"/>
+              <w:bottom w:type="dxa" w:w="80"/>
+              <w:right w:type="dxa" w:w="120"/>
+            </w:tcMar>
+          </w:tcPr>
+          <w:p>
+            <w:pPr>
+              <w:spacing w:after="40" w:line="262" w:before="0" w:lineRule="auto"/>
+            </w:pPr>
+            <w:r>
+              <w:rPr>
+                <w:rFonts w:ascii="Arial" w:cs="Times New Roman" w:eastAsia="Times New Roman" w:hAnsi="Arial"/>
+                <w:b/>
+                <w:bCs/>
+                <w:color w:val="FFFFFF"/>
+                <w:sz w:val="18"/>
                 <w:szCs w:val="22"/>
               </w:rPr>
               <w:t xml:space="preserve">Что вписать</w:t>
@@ -1345,24 +1295,25 @@
         <w:tc>
           <w:tcPr>
             <w:tcW w:type="dxa" w:w="2860"/>
-            <w:shd w:fill="EDEDED" w:val="clear"/>
-            <w:tcMar>
-              <w:top w:type="dxa" w:w="80"/>
-              <w:left w:type="dxa" w:w="120"/>
-              <w:bottom w:type="dxa" w:w="80"/>
-              <w:right w:type="dxa" w:w="120"/>
-            </w:tcMar>
-          </w:tcPr>
-          <w:p>
-            <w:pPr>
-              <w:spacing w:after="0" w:line="240"/>
-            </w:pPr>
-            <w:r>
-              <w:rPr>
-                <w:rFonts w:ascii="Times New Roman" w:cs="Times New Roman" w:eastAsia="Times New Roman" w:hAnsi="Times New Roman"/>
-                <w:b/>
-                <w:bCs/>
-                <w:sz w:val="22"/>
+            <w:shd w:fill="303941" w:val="clear"/>
+            <w:tcMar>
+              <w:top w:type="dxa" w:w="80"/>
+              <w:left w:type="dxa" w:w="120"/>
+              <w:bottom w:type="dxa" w:w="80"/>
+              <w:right w:type="dxa" w:w="120"/>
+            </w:tcMar>
+          </w:tcPr>
+          <w:p>
+            <w:pPr>
+              <w:spacing w:after="40" w:line="262" w:before="0" w:lineRule="auto"/>
+            </w:pPr>
+            <w:r>
+              <w:rPr>
+                <w:rFonts w:ascii="Arial" w:cs="Times New Roman" w:eastAsia="Times New Roman" w:hAnsi="Arial"/>
+                <w:b/>
+                <w:bCs/>
+                <w:color w:val="FFFFFF"/>
+                <w:sz w:val="18"/>
                 <w:szCs w:val="22"/>
               </w:rPr>
               <w:t xml:space="preserve">Откуда взять</w:t>
@@ -1383,40 +1334,41 @@
           </w:tcPr>
           <w:p>
             <w:pPr>
-              <w:spacing w:after="0" w:line="240"/>
-            </w:pPr>
-            <w:r>
-              <w:rPr>
-                <w:rFonts w:ascii="Times New Roman" w:cs="Times New Roman" w:eastAsia="Times New Roman" w:hAnsi="Times New Roman"/>
-                <w:b/>
-                <w:bCs/>
-                <w:i w:val="false"/>
-                <w:iCs w:val="false"/>
-                <w:color w:val="000000"/>
-                <w:sz w:val="22"/>
+              <w:spacing w:after="40" w:line="262" w:before="0" w:lineRule="auto"/>
+            </w:pPr>
+            <w:r>
+              <w:rPr>
+                <w:rFonts w:ascii="Arial" w:cs="Times New Roman" w:eastAsia="Times New Roman" w:hAnsi="Arial"/>
+                <w:b/>
+                <w:bCs/>
+                <w:i w:val="false"/>
+                <w:iCs w:val="false"/>
+                <w:color w:val="293137"/>
+                <w:sz w:val="18"/>
                 <w:szCs w:val="22"/>
               </w:rPr>
               <w:t xml:space="preserve">{{НОМЕР_ПИСЬМА}}</w:t>
             </w:r>
             <w:r>
               <w:rPr>
-                <w:rFonts w:ascii="Times New Roman" w:cs="Times New Roman" w:eastAsia="Times New Roman" w:hAnsi="Times New Roman"/>
-                <w:b w:val="false"/>
-                <w:bCs w:val="false"/>
-                <w:sz w:val="22"/>
+                <w:rFonts w:ascii="Arial" w:cs="Times New Roman" w:eastAsia="Times New Roman" w:hAnsi="Arial"/>
+                <w:b w:val="0"/>
+                <w:bCs w:val="false"/>
+                <w:color w:val="293137"/>
+                <w:sz w:val="18"/>
                 <w:szCs w:val="22"/>
               </w:rPr>
               <w:t xml:space="preserve">, </w:t>
             </w:r>
             <w:r>
               <w:rPr>
-                <w:rFonts w:ascii="Times New Roman" w:cs="Times New Roman" w:eastAsia="Times New Roman" w:hAnsi="Times New Roman"/>
-                <w:b/>
-                <w:bCs/>
-                <w:i w:val="false"/>
-                <w:iCs w:val="false"/>
-                <w:color w:val="000000"/>
-                <w:sz w:val="22"/>
+                <w:rFonts w:ascii="Arial" w:cs="Times New Roman" w:eastAsia="Times New Roman" w:hAnsi="Arial"/>
+                <w:b/>
+                <w:bCs/>
+                <w:i w:val="false"/>
+                <w:iCs w:val="false"/>
+                <w:color w:val="293137"/>
+                <w:sz w:val="18"/>
                 <w:szCs w:val="22"/>
               </w:rPr>
               <w:t xml:space="preserve">{{ДАТА_ПИСЬМА}}</w:t>
@@ -1435,14 +1387,15 @@
           </w:tcPr>
           <w:p>
             <w:pPr>
-              <w:spacing w:after="0" w:line="240"/>
-            </w:pPr>
-            <w:r>
-              <w:rPr>
-                <w:rFonts w:ascii="Times New Roman" w:cs="Times New Roman" w:eastAsia="Times New Roman" w:hAnsi="Times New Roman"/>
-                <w:b w:val="false"/>
-                <w:bCs w:val="false"/>
-                <w:sz w:val="22"/>
+              <w:spacing w:after="40" w:line="262" w:before="0" w:lineRule="auto"/>
+            </w:pPr>
+            <w:r>
+              <w:rPr>
+                <w:rFonts w:ascii="Arial" w:cs="Times New Roman" w:eastAsia="Times New Roman" w:hAnsi="Arial"/>
+                <w:b w:val="0"/>
+                <w:bCs w:val="false"/>
+                <w:color w:val="293137"/>
+                <w:sz w:val="18"/>
                 <w:szCs w:val="22"/>
               </w:rPr>
               <w:t xml:space="preserve">Исходящий номер и дата сопроводительного письма</w:t>
@@ -1461,14 +1414,15 @@
           </w:tcPr>
           <w:p>
             <w:pPr>
-              <w:spacing w:after="0" w:line="240"/>
-            </w:pPr>
-            <w:r>
-              <w:rPr>
-                <w:rFonts w:ascii="Times New Roman" w:cs="Times New Roman" w:eastAsia="Times New Roman" w:hAnsi="Times New Roman"/>
-                <w:b w:val="false"/>
-                <w:bCs w:val="false"/>
-                <w:sz w:val="22"/>
+              <w:spacing w:after="40" w:line="262" w:before="0" w:lineRule="auto"/>
+            </w:pPr>
+            <w:r>
+              <w:rPr>
+                <w:rFonts w:ascii="Arial" w:cs="Times New Roman" w:eastAsia="Times New Roman" w:hAnsi="Arial"/>
+                <w:b w:val="0"/>
+                <w:bCs w:val="false"/>
+                <w:color w:val="293137"/>
+                <w:sz w:val="18"/>
                 <w:szCs w:val="22"/>
               </w:rPr>
               <w:t xml:space="preserve">ваш журнал исходящей корреспонденции</w:t>
@@ -1486,43 +1440,45 @@
               <w:bottom w:type="dxa" w:w="80"/>
               <w:right w:type="dxa" w:w="120"/>
             </w:tcMar>
-          </w:tcPr>
-          <w:p>
-            <w:pPr>
-              <w:spacing w:after="0" w:line="240"/>
-            </w:pPr>
-            <w:r>
-              <w:rPr>
-                <w:rFonts w:ascii="Times New Roman" w:cs="Times New Roman" w:eastAsia="Times New Roman" w:hAnsi="Times New Roman"/>
-                <w:b/>
-                <w:bCs/>
-                <w:i w:val="false"/>
-                <w:iCs w:val="false"/>
-                <w:color w:val="000000"/>
-                <w:sz w:val="22"/>
+            <w:shd w:fill="F4F5F5"/>
+          </w:tcPr>
+          <w:p>
+            <w:pPr>
+              <w:spacing w:after="40" w:line="262" w:before="0" w:lineRule="auto"/>
+            </w:pPr>
+            <w:r>
+              <w:rPr>
+                <w:rFonts w:ascii="Arial" w:cs="Times New Roman" w:eastAsia="Times New Roman" w:hAnsi="Arial"/>
+                <w:b/>
+                <w:bCs/>
+                <w:i w:val="false"/>
+                <w:iCs w:val="false"/>
+                <w:color w:val="293137"/>
+                <w:sz w:val="18"/>
                 <w:szCs w:val="22"/>
               </w:rPr>
               <w:t xml:space="preserve">{{НОМЕР_ДОГОВОРА}}</w:t>
             </w:r>
             <w:r>
               <w:rPr>
-                <w:rFonts w:ascii="Times New Roman" w:cs="Times New Roman" w:eastAsia="Times New Roman" w:hAnsi="Times New Roman"/>
-                <w:b w:val="false"/>
-                <w:bCs w:val="false"/>
-                <w:sz w:val="22"/>
+                <w:rFonts w:ascii="Arial" w:cs="Times New Roman" w:eastAsia="Times New Roman" w:hAnsi="Arial"/>
+                <w:b w:val="0"/>
+                <w:bCs w:val="false"/>
+                <w:color w:val="293137"/>
+                <w:sz w:val="18"/>
                 <w:szCs w:val="22"/>
               </w:rPr>
               <w:t xml:space="preserve">, </w:t>
             </w:r>
             <w:r>
               <w:rPr>
-                <w:rFonts w:ascii="Times New Roman" w:cs="Times New Roman" w:eastAsia="Times New Roman" w:hAnsi="Times New Roman"/>
-                <w:b/>
-                <w:bCs/>
-                <w:i w:val="false"/>
-                <w:iCs w:val="false"/>
-                <w:color w:val="000000"/>
-                <w:sz w:val="22"/>
+                <w:rFonts w:ascii="Arial" w:cs="Times New Roman" w:eastAsia="Times New Roman" w:hAnsi="Arial"/>
+                <w:b/>
+                <w:bCs/>
+                <w:i w:val="false"/>
+                <w:iCs w:val="false"/>
+                <w:color w:val="293137"/>
+                <w:sz w:val="18"/>
                 <w:szCs w:val="22"/>
               </w:rPr>
               <w:t xml:space="preserve">{{ДАТА_ДОГОВОРА}}</w:t>
@@ -1538,17 +1494,19 @@
               <w:bottom w:type="dxa" w:w="80"/>
               <w:right w:type="dxa" w:w="120"/>
             </w:tcMar>
-          </w:tcPr>
-          <w:p>
-            <w:pPr>
-              <w:spacing w:after="0" w:line="240"/>
-            </w:pPr>
-            <w:r>
-              <w:rPr>
-                <w:rFonts w:ascii="Times New Roman" w:cs="Times New Roman" w:eastAsia="Times New Roman" w:hAnsi="Times New Roman"/>
-                <w:b w:val="false"/>
-                <w:bCs w:val="false"/>
-                <w:sz w:val="22"/>
+            <w:shd w:fill="F4F5F5"/>
+          </w:tcPr>
+          <w:p>
+            <w:pPr>
+              <w:spacing w:after="40" w:line="262" w:before="0" w:lineRule="auto"/>
+            </w:pPr>
+            <w:r>
+              <w:rPr>
+                <w:rFonts w:ascii="Arial" w:cs="Times New Roman" w:eastAsia="Times New Roman" w:hAnsi="Arial"/>
+                <w:b w:val="0"/>
+                <w:bCs w:val="false"/>
+                <w:color w:val="293137"/>
+                <w:sz w:val="18"/>
                 <w:szCs w:val="22"/>
               </w:rPr>
               <w:t xml:space="preserve">Реквизиты договора, по которому передаётся документация</w:t>
@@ -1564,17 +1522,19 @@
               <w:bottom w:type="dxa" w:w="80"/>
               <w:right w:type="dxa" w:w="120"/>
             </w:tcMar>
-          </w:tcPr>
-          <w:p>
-            <w:pPr>
-              <w:spacing w:after="0" w:line="240"/>
-            </w:pPr>
-            <w:r>
-              <w:rPr>
-                <w:rFonts w:ascii="Times New Roman" w:cs="Times New Roman" w:eastAsia="Times New Roman" w:hAnsi="Times New Roman"/>
-                <w:b w:val="false"/>
-                <w:bCs w:val="false"/>
-                <w:sz w:val="22"/>
+            <w:shd w:fill="F4F5F5"/>
+          </w:tcPr>
+          <w:p>
+            <w:pPr>
+              <w:spacing w:after="40" w:line="262" w:before="0" w:lineRule="auto"/>
+            </w:pPr>
+            <w:r>
+              <w:rPr>
+                <w:rFonts w:ascii="Arial" w:cs="Times New Roman" w:eastAsia="Times New Roman" w:hAnsi="Arial"/>
+                <w:b w:val="0"/>
+                <w:bCs w:val="false"/>
+                <w:color w:val="293137"/>
+                <w:sz w:val="18"/>
                 <w:szCs w:val="22"/>
               </w:rPr>
               <w:t xml:space="preserve">сам договор</w:t>
@@ -1595,17 +1555,17 @@
           </w:tcPr>
           <w:p>
             <w:pPr>
-              <w:spacing w:after="0" w:line="240"/>
-            </w:pPr>
-            <w:r>
-              <w:rPr>
-                <w:rFonts w:ascii="Times New Roman" w:cs="Times New Roman" w:eastAsia="Times New Roman" w:hAnsi="Times New Roman"/>
-                <w:b/>
-                <w:bCs/>
-                <w:i w:val="false"/>
-                <w:iCs w:val="false"/>
-                <w:color w:val="000000"/>
-                <w:sz w:val="22"/>
+              <w:spacing w:after="40" w:line="262" w:before="0" w:lineRule="auto"/>
+            </w:pPr>
+            <w:r>
+              <w:rPr>
+                <w:rFonts w:ascii="Arial" w:cs="Times New Roman" w:eastAsia="Times New Roman" w:hAnsi="Arial"/>
+                <w:b/>
+                <w:bCs/>
+                <w:i w:val="false"/>
+                <w:iCs w:val="false"/>
+                <w:color w:val="293137"/>
+                <w:sz w:val="18"/>
                 <w:szCs w:val="22"/>
               </w:rPr>
               <w:t xml:space="preserve">{{ОБЪЕКТ}}</w:t>
@@ -1624,14 +1584,15 @@
           </w:tcPr>
           <w:p>
             <w:pPr>
-              <w:spacing w:after="0" w:line="240"/>
-            </w:pPr>
-            <w:r>
-              <w:rPr>
-                <w:rFonts w:ascii="Times New Roman" w:cs="Times New Roman" w:eastAsia="Times New Roman" w:hAnsi="Times New Roman"/>
-                <w:b w:val="false"/>
-                <w:bCs w:val="false"/>
-                <w:sz w:val="22"/>
+              <w:spacing w:after="40" w:line="262" w:before="0" w:lineRule="auto"/>
+            </w:pPr>
+            <w:r>
+              <w:rPr>
+                <w:rFonts w:ascii="Arial" w:cs="Times New Roman" w:eastAsia="Times New Roman" w:hAnsi="Arial"/>
+                <w:b w:val="0"/>
+                <w:bCs w:val="false"/>
+                <w:color w:val="293137"/>
+                <w:sz w:val="18"/>
                 <w:szCs w:val="22"/>
               </w:rPr>
               <w:t xml:space="preserve">Наименование объекта так, как оно записано в договоре, — не рабочее название стройки</w:t>
@@ -1650,17 +1611,18 @@
           </w:tcPr>
           <w:p>
             <w:pPr>
-              <w:spacing w:after="0" w:line="240"/>
-            </w:pPr>
-            <w:r>
-              <w:rPr>
-                <w:rFonts w:ascii="Times New Roman" w:cs="Times New Roman" w:eastAsia="Times New Roman" w:hAnsi="Times New Roman"/>
-                <w:b w:val="false"/>
-                <w:bCs w:val="false"/>
-                <w:sz w:val="22"/>
-                <w:szCs w:val="22"/>
-              </w:rPr>
-              <w:t xml:space="preserve">договор, разрешение на строительство</w:t>
+              <w:spacing w:after="40" w:line="262" w:before="0" w:lineRule="auto"/>
+            </w:pPr>
+            <w:r>
+              <w:rPr>
+                <w:rFonts w:ascii="Arial" w:cs="Times New Roman" w:eastAsia="Times New Roman" w:hAnsi="Arial"/>
+                <w:b w:val="0"/>
+                <w:bCs w:val="false"/>
+                <w:color w:val="293137"/>
+                <w:sz w:val="18"/>
+                <w:szCs w:val="22"/>
+              </w:rPr>
+              <w:t xml:space="preserve">договор и проектная документация</w:t>
             </w:r>
           </w:p>
         </w:tc>
@@ -1675,20 +1637,21 @@
               <w:bottom w:type="dxa" w:w="80"/>
               <w:right w:type="dxa" w:w="120"/>
             </w:tcMar>
-          </w:tcPr>
-          <w:p>
-            <w:pPr>
-              <w:spacing w:after="0" w:line="240"/>
-            </w:pPr>
-            <w:r>
-              <w:rPr>
-                <w:rFonts w:ascii="Times New Roman" w:cs="Times New Roman" w:eastAsia="Times New Roman" w:hAnsi="Times New Roman"/>
-                <w:b/>
-                <w:bCs/>
-                <w:i w:val="false"/>
-                <w:iCs w:val="false"/>
-                <w:color w:val="000000"/>
-                <w:sz w:val="22"/>
+            <w:shd w:fill="F4F5F5"/>
+          </w:tcPr>
+          <w:p>
+            <w:pPr>
+              <w:spacing w:after="40" w:line="262" w:before="0" w:lineRule="auto"/>
+            </w:pPr>
+            <w:r>
+              <w:rPr>
+                <w:rFonts w:ascii="Arial" w:cs="Times New Roman" w:eastAsia="Times New Roman" w:hAnsi="Arial"/>
+                <w:b/>
+                <w:bCs/>
+                <w:i w:val="false"/>
+                <w:iCs w:val="false"/>
+                <w:color w:val="293137"/>
+                <w:sz w:val="18"/>
                 <w:szCs w:val="22"/>
               </w:rPr>
               <w:t xml:space="preserve">{{УЧАСТОК_ЭТАП_ВИД_РАБОТ}}</w:t>
@@ -1704,17 +1667,19 @@
               <w:bottom w:type="dxa" w:w="80"/>
               <w:right w:type="dxa" w:w="120"/>
             </w:tcMar>
-          </w:tcPr>
-          <w:p>
-            <w:pPr>
-              <w:spacing w:after="0" w:line="240"/>
-            </w:pPr>
-            <w:r>
-              <w:rPr>
-                <w:rFonts w:ascii="Times New Roman" w:cs="Times New Roman" w:eastAsia="Times New Roman" w:hAnsi="Times New Roman"/>
-                <w:b w:val="false"/>
-                <w:bCs w:val="false"/>
-                <w:sz w:val="22"/>
+            <w:shd w:fill="F4F5F5"/>
+          </w:tcPr>
+          <w:p>
+            <w:pPr>
+              <w:spacing w:after="40" w:line="262" w:before="0" w:lineRule="auto"/>
+            </w:pPr>
+            <w:r>
+              <w:rPr>
+                <w:rFonts w:ascii="Arial" w:cs="Times New Roman" w:eastAsia="Times New Roman" w:hAnsi="Arial"/>
+                <w:b w:val="0"/>
+                <w:bCs w:val="false"/>
+                <w:color w:val="293137"/>
+                <w:sz w:val="18"/>
                 <w:szCs w:val="22"/>
               </w:rPr>
               <w:t xml:space="preserve">За что именно комплект: участок, оси и отметки, этап или вид работ. Формулировка должна совпадать с той, которой участок назван в актах</w:t>
@@ -1730,17 +1695,19 @@
               <w:bottom w:type="dxa" w:w="80"/>
               <w:right w:type="dxa" w:w="120"/>
             </w:tcMar>
-          </w:tcPr>
-          <w:p>
-            <w:pPr>
-              <w:spacing w:after="0" w:line="240"/>
-            </w:pPr>
-            <w:r>
-              <w:rPr>
-                <w:rFonts w:ascii="Times New Roman" w:cs="Times New Roman" w:eastAsia="Times New Roman" w:hAnsi="Times New Roman"/>
-                <w:b w:val="false"/>
-                <w:bCs w:val="false"/>
-                <w:sz w:val="22"/>
+            <w:shd w:fill="F4F5F5"/>
+          </w:tcPr>
+          <w:p>
+            <w:pPr>
+              <w:spacing w:after="40" w:line="262" w:before="0" w:lineRule="auto"/>
+            </w:pPr>
+            <w:r>
+              <w:rPr>
+                <w:rFonts w:ascii="Arial" w:cs="Times New Roman" w:eastAsia="Times New Roman" w:hAnsi="Arial"/>
+                <w:b w:val="0"/>
+                <w:bCs w:val="false"/>
+                <w:color w:val="293137"/>
+                <w:sz w:val="18"/>
                 <w:szCs w:val="22"/>
               </w:rPr>
               <w:t xml:space="preserve">договор, ведомость объёмов, ваши акты</w:t>
@@ -1761,17 +1728,17 @@
           </w:tcPr>
           <w:p>
             <w:pPr>
-              <w:spacing w:after="0" w:line="240"/>
-            </w:pPr>
-            <w:r>
-              <w:rPr>
-                <w:rFonts w:ascii="Times New Roman" w:cs="Times New Roman" w:eastAsia="Times New Roman" w:hAnsi="Times New Roman"/>
-                <w:b/>
-                <w:bCs/>
-                <w:i w:val="false"/>
-                <w:iCs w:val="false"/>
-                <w:color w:val="000000"/>
-                <w:sz w:val="22"/>
+              <w:spacing w:after="40" w:line="262" w:before="0" w:lineRule="auto"/>
+            </w:pPr>
+            <w:r>
+              <w:rPr>
+                <w:rFonts w:ascii="Arial" w:cs="Times New Roman" w:eastAsia="Times New Roman" w:hAnsi="Arial"/>
+                <w:b/>
+                <w:bCs/>
+                <w:i w:val="false"/>
+                <w:iCs w:val="false"/>
+                <w:color w:val="293137"/>
+                <w:sz w:val="18"/>
                 <w:szCs w:val="22"/>
               </w:rPr>
               <w:t xml:space="preserve">{{ПУНКТ_ДОГОВОРА_О_ПЕРЕДАЧЕ}}</w:t>
@@ -1790,14 +1757,15 @@
           </w:tcPr>
           <w:p>
             <w:pPr>
-              <w:spacing w:after="0" w:line="240"/>
-            </w:pPr>
-            <w:r>
-              <w:rPr>
-                <w:rFonts w:ascii="Times New Roman" w:cs="Times New Roman" w:eastAsia="Times New Roman" w:hAnsi="Times New Roman"/>
-                <w:b w:val="false"/>
-                <w:bCs w:val="false"/>
-                <w:sz w:val="22"/>
+              <w:spacing w:after="40" w:line="262" w:before="0" w:lineRule="auto"/>
+            </w:pPr>
+            <w:r>
+              <w:rPr>
+                <w:rFonts w:ascii="Arial" w:cs="Times New Roman" w:eastAsia="Times New Roman" w:hAnsi="Arial"/>
+                <w:b w:val="0"/>
+                <w:bCs w:val="false"/>
+                <w:color w:val="293137"/>
+                <w:sz w:val="18"/>
                 <w:szCs w:val="22"/>
               </w:rPr>
               <w:t xml:space="preserve">Пункт договора о составе, форме и порядке передачи документации. Пункта нет — так и пишется: «договором порядок не установлен»</w:t>
@@ -1816,14 +1784,15 @@
           </w:tcPr>
           <w:p>
             <w:pPr>
-              <w:spacing w:after="0" w:line="240"/>
-            </w:pPr>
-            <w:r>
-              <w:rPr>
-                <w:rFonts w:ascii="Times New Roman" w:cs="Times New Roman" w:eastAsia="Times New Roman" w:hAnsi="Times New Roman"/>
-                <w:b w:val="false"/>
-                <w:bCs w:val="false"/>
-                <w:sz w:val="22"/>
+              <w:spacing w:after="40" w:line="262" w:before="0" w:lineRule="auto"/>
+            </w:pPr>
+            <w:r>
+              <w:rPr>
+                <w:rFonts w:ascii="Arial" w:cs="Times New Roman" w:eastAsia="Times New Roman" w:hAnsi="Arial"/>
+                <w:b w:val="0"/>
+                <w:bCs w:val="false"/>
+                <w:color w:val="293137"/>
+                <w:sz w:val="18"/>
                 <w:szCs w:val="22"/>
               </w:rPr>
               <w:t xml:space="preserve">договор; если пункта нет — переписка о порядке передачи</w:t>
@@ -1841,20 +1810,21 @@
               <w:bottom w:type="dxa" w:w="80"/>
               <w:right w:type="dxa" w:w="120"/>
             </w:tcMar>
-          </w:tcPr>
-          <w:p>
-            <w:pPr>
-              <w:spacing w:after="0" w:line="240"/>
-            </w:pPr>
-            <w:r>
-              <w:rPr>
-                <w:rFonts w:ascii="Times New Roman" w:cs="Times New Roman" w:eastAsia="Times New Roman" w:hAnsi="Times New Roman"/>
-                <w:b/>
-                <w:bCs/>
-                <w:i w:val="false"/>
-                <w:iCs w:val="false"/>
-                <w:color w:val="000000"/>
-                <w:sz w:val="22"/>
+            <w:shd w:fill="F4F5F5"/>
+          </w:tcPr>
+          <w:p>
+            <w:pPr>
+              <w:spacing w:after="40" w:line="262" w:before="0" w:lineRule="auto"/>
+            </w:pPr>
+            <w:r>
+              <w:rPr>
+                <w:rFonts w:ascii="Arial" w:cs="Times New Roman" w:eastAsia="Times New Roman" w:hAnsi="Arial"/>
+                <w:b/>
+                <w:bCs/>
+                <w:i w:val="false"/>
+                <w:iCs w:val="false"/>
+                <w:color w:val="293137"/>
+                <w:sz w:val="18"/>
                 <w:szCs w:val="22"/>
               </w:rPr>
               <w:t xml:space="preserve">{{СРОК_РАССМОТРЕНИЯ_ИЗ_ДОГОВОРА}}</w:t>
@@ -1870,17 +1840,19 @@
               <w:bottom w:type="dxa" w:w="80"/>
               <w:right w:type="dxa" w:w="120"/>
             </w:tcMar>
-          </w:tcPr>
-          <w:p>
-            <w:pPr>
-              <w:spacing w:after="0" w:line="240"/>
-            </w:pPr>
-            <w:r>
-              <w:rPr>
-                <w:rFonts w:ascii="Times New Roman" w:cs="Times New Roman" w:eastAsia="Times New Roman" w:hAnsi="Times New Roman"/>
-                <w:b w:val="false"/>
-                <w:bCs w:val="false"/>
-                <w:sz w:val="22"/>
+            <w:shd w:fill="F4F5F5"/>
+          </w:tcPr>
+          <w:p>
+            <w:pPr>
+              <w:spacing w:after="40" w:line="262" w:before="0" w:lineRule="auto"/>
+            </w:pPr>
+            <w:r>
+              <w:rPr>
+                <w:rFonts w:ascii="Arial" w:cs="Times New Roman" w:eastAsia="Times New Roman" w:hAnsi="Arial"/>
+                <w:b w:val="0"/>
+                <w:bCs w:val="false"/>
+                <w:color w:val="293137"/>
+                <w:sz w:val="18"/>
                 <w:szCs w:val="22"/>
               </w:rPr>
               <w:t xml:space="preserve">Срок рассмотрения переданного комплекта — словами договора, а не числом из справочника. Договор молчит — пишется «срок договором не установлен» и предлагается разумный срок вашей формулировкой</w:t>
@@ -1896,20 +1868,22 @@
               <w:bottom w:type="dxa" w:w="80"/>
               <w:right w:type="dxa" w:w="120"/>
             </w:tcMar>
-          </w:tcPr>
-          <w:p>
-            <w:pPr>
-              <w:spacing w:after="0" w:line="240"/>
-            </w:pPr>
-            <w:r>
-              <w:rPr>
-                <w:rFonts w:ascii="Times New Roman" w:cs="Times New Roman" w:eastAsia="Times New Roman" w:hAnsi="Times New Roman"/>
-                <w:b w:val="false"/>
-                <w:bCs w:val="false"/>
-                <w:sz w:val="22"/>
-                <w:szCs w:val="22"/>
-              </w:rPr>
-              <w:t xml:space="preserve">договор; в файл число не записано намеренно</w:t>
+            <w:shd w:fill="F4F5F5"/>
+          </w:tcPr>
+          <w:p>
+            <w:pPr>
+              <w:spacing w:after="40" w:line="262" w:before="0" w:lineRule="auto"/>
+            </w:pPr>
+            <w:r>
+              <w:rPr>
+                <w:rFonts w:ascii="Arial" w:cs="Times New Roman" w:eastAsia="Times New Roman" w:hAnsi="Arial"/>
+                <w:b w:val="0"/>
+                <w:bCs w:val="false"/>
+                <w:color w:val="293137"/>
+                <w:sz w:val="18"/>
+                <w:szCs w:val="22"/>
+              </w:rPr>
+              <w:t xml:space="preserve">договор и согласованная переписка о сроке рассмотрения</w:t>
             </w:r>
           </w:p>
         </w:tc>
@@ -1927,17 +1901,17 @@
           </w:tcPr>
           <w:p>
             <w:pPr>
-              <w:spacing w:after="0" w:line="240"/>
-            </w:pPr>
-            <w:r>
-              <w:rPr>
-                <w:rFonts w:ascii="Times New Roman" w:cs="Times New Roman" w:eastAsia="Times New Roman" w:hAnsi="Times New Roman"/>
-                <w:b/>
-                <w:bCs/>
-                <w:i w:val="false"/>
-                <w:iCs w:val="false"/>
-                <w:color w:val="000000"/>
-                <w:sz w:val="22"/>
+              <w:spacing w:after="40" w:line="262" w:before="0" w:lineRule="auto"/>
+            </w:pPr>
+            <w:r>
+              <w:rPr>
+                <w:rFonts w:ascii="Arial" w:cs="Times New Roman" w:eastAsia="Times New Roman" w:hAnsi="Arial"/>
+                <w:b/>
+                <w:bCs/>
+                <w:i w:val="false"/>
+                <w:iCs w:val="false"/>
+                <w:color w:val="293137"/>
+                <w:sz w:val="18"/>
                 <w:szCs w:val="22"/>
               </w:rPr>
               <w:t xml:space="preserve">{{ПЕРЕЧЕНЬ_КС}}</w:t>
@@ -1956,17 +1930,18 @@
           </w:tcPr>
           <w:p>
             <w:pPr>
-              <w:spacing w:after="0" w:line="240"/>
-            </w:pPr>
-            <w:r>
-              <w:rPr>
-                <w:rFonts w:ascii="Times New Roman" w:cs="Times New Roman" w:eastAsia="Times New Roman" w:hAnsi="Times New Roman"/>
-                <w:b w:val="false"/>
-                <w:bCs w:val="false"/>
-                <w:sz w:val="22"/>
-                <w:szCs w:val="22"/>
-              </w:rPr>
-              <w:t xml:space="preserve">Какие акты выполненных работ подтверждает этот комплект: номера и даты. Это то, ради чего документацию и передают</w:t>
+              <w:spacing w:after="40" w:line="262" w:before="0" w:lineRule="auto"/>
+            </w:pPr>
+            <w:r>
+              <w:rPr>
+                <w:rFonts w:ascii="Arial" w:cs="Times New Roman" w:eastAsia="Times New Roman" w:hAnsi="Arial"/>
+                <w:b w:val="0"/>
+                <w:bCs w:val="false"/>
+                <w:color w:val="293137"/>
+                <w:sz w:val="18"/>
+                <w:szCs w:val="22"/>
+              </w:rPr>
+              <w:t xml:space="preserve">Номера и даты актов выполненных работ, к которым относится передаваемая документация</w:t>
             </w:r>
           </w:p>
         </w:tc>
@@ -1982,14 +1957,15 @@
           </w:tcPr>
           <w:p>
             <w:pPr>
-              <w:spacing w:after="0" w:line="240"/>
-            </w:pPr>
-            <w:r>
-              <w:rPr>
-                <w:rFonts w:ascii="Times New Roman" w:cs="Times New Roman" w:eastAsia="Times New Roman" w:hAnsi="Times New Roman"/>
-                <w:b w:val="false"/>
-                <w:bCs w:val="false"/>
-                <w:sz w:val="22"/>
+              <w:spacing w:after="40" w:line="262" w:before="0" w:lineRule="auto"/>
+            </w:pPr>
+            <w:r>
+              <w:rPr>
+                <w:rFonts w:ascii="Arial" w:cs="Times New Roman" w:eastAsia="Times New Roman" w:hAnsi="Arial"/>
+                <w:b w:val="0"/>
+                <w:bCs w:val="false"/>
+                <w:color w:val="293137"/>
+                <w:sz w:val="18"/>
                 <w:szCs w:val="22"/>
               </w:rPr>
               <w:t xml:space="preserve">ваши подписанные и предъявленные акты</w:t>
@@ -2007,43 +1983,45 @@
               <w:bottom w:type="dxa" w:w="80"/>
               <w:right w:type="dxa" w:w="120"/>
             </w:tcMar>
-          </w:tcPr>
-          <w:p>
-            <w:pPr>
-              <w:spacing w:after="0" w:line="240"/>
-            </w:pPr>
-            <w:r>
-              <w:rPr>
-                <w:rFonts w:ascii="Times New Roman" w:cs="Times New Roman" w:eastAsia="Times New Roman" w:hAnsi="Times New Roman"/>
-                <w:b/>
-                <w:bCs/>
-                <w:i w:val="false"/>
-                <w:iCs w:val="false"/>
-                <w:color w:val="000000"/>
-                <w:sz w:val="22"/>
+            <w:shd w:fill="F4F5F5"/>
+          </w:tcPr>
+          <w:p>
+            <w:pPr>
+              <w:spacing w:after="40" w:line="262" w:before="0" w:lineRule="auto"/>
+            </w:pPr>
+            <w:r>
+              <w:rPr>
+                <w:rFonts w:ascii="Arial" w:cs="Times New Roman" w:eastAsia="Times New Roman" w:hAnsi="Arial"/>
+                <w:b/>
+                <w:bCs/>
+                <w:i w:val="false"/>
+                <w:iCs w:val="false"/>
+                <w:color w:val="293137"/>
+                <w:sz w:val="18"/>
                 <w:szCs w:val="22"/>
               </w:rPr>
               <w:t xml:space="preserve">{{НОМЕР_ОПИСИ}}</w:t>
             </w:r>
             <w:r>
               <w:rPr>
-                <w:rFonts w:ascii="Times New Roman" w:cs="Times New Roman" w:eastAsia="Times New Roman" w:hAnsi="Times New Roman"/>
-                <w:b w:val="false"/>
-                <w:bCs w:val="false"/>
-                <w:sz w:val="22"/>
+                <w:rFonts w:ascii="Arial" w:cs="Times New Roman" w:eastAsia="Times New Roman" w:hAnsi="Arial"/>
+                <w:b w:val="0"/>
+                <w:bCs w:val="false"/>
+                <w:color w:val="293137"/>
+                <w:sz w:val="18"/>
                 <w:szCs w:val="22"/>
               </w:rPr>
               <w:t xml:space="preserve">, </w:t>
             </w:r>
             <w:r>
               <w:rPr>
-                <w:rFonts w:ascii="Times New Roman" w:cs="Times New Roman" w:eastAsia="Times New Roman" w:hAnsi="Times New Roman"/>
-                <w:b/>
-                <w:bCs/>
-                <w:i w:val="false"/>
-                <w:iCs w:val="false"/>
-                <w:color w:val="000000"/>
-                <w:sz w:val="22"/>
+                <w:rFonts w:ascii="Arial" w:cs="Times New Roman" w:eastAsia="Times New Roman" w:hAnsi="Arial"/>
+                <w:b/>
+                <w:bCs/>
+                <w:i w:val="false"/>
+                <w:iCs w:val="false"/>
+                <w:color w:val="293137"/>
+                <w:sz w:val="18"/>
                 <w:szCs w:val="22"/>
               </w:rPr>
               <w:t xml:space="preserve">{{ДАТА_ОПИСИ}}</w:t>
@@ -2059,17 +2037,19 @@
               <w:bottom w:type="dxa" w:w="80"/>
               <w:right w:type="dxa" w:w="120"/>
             </w:tcMar>
-          </w:tcPr>
-          <w:p>
-            <w:pPr>
-              <w:spacing w:after="0" w:line="240"/>
-            </w:pPr>
-            <w:r>
-              <w:rPr>
-                <w:rFonts w:ascii="Times New Roman" w:cs="Times New Roman" w:eastAsia="Times New Roman" w:hAnsi="Times New Roman"/>
-                <w:b w:val="false"/>
-                <w:bCs w:val="false"/>
-                <w:sz w:val="22"/>
+            <w:shd w:fill="F4F5F5"/>
+          </w:tcPr>
+          <w:p>
+            <w:pPr>
+              <w:spacing w:after="40" w:line="262" w:before="0" w:lineRule="auto"/>
+            </w:pPr>
+            <w:r>
+              <w:rPr>
+                <w:rFonts w:ascii="Arial" w:cs="Times New Roman" w:eastAsia="Times New Roman" w:hAnsi="Arial"/>
+                <w:b w:val="0"/>
+                <w:bCs w:val="false"/>
+                <w:color w:val="293137"/>
+                <w:sz w:val="18"/>
                 <w:szCs w:val="22"/>
               </w:rPr>
               <w:t xml:space="preserve">Номер и дата описи передаваемого комплекта — файла «Опись передаваемого комплекта». Опись нумеруется отдельно от письма</w:t>
@@ -2085,20 +2065,22 @@
               <w:bottom w:type="dxa" w:w="80"/>
               <w:right w:type="dxa" w:w="120"/>
             </w:tcMar>
-          </w:tcPr>
-          <w:p>
-            <w:pPr>
-              <w:spacing w:after="0" w:line="240"/>
-            </w:pPr>
-            <w:r>
-              <w:rPr>
-                <w:rFonts w:ascii="Times New Roman" w:cs="Times New Roman" w:eastAsia="Times New Roman" w:hAnsi="Times New Roman"/>
-                <w:b w:val="false"/>
-                <w:bCs w:val="false"/>
-                <w:sz w:val="22"/>
-                <w:szCs w:val="22"/>
-              </w:rPr>
-              <w:t xml:space="preserve">лист «Опись» файла 62</w:t>
+            <w:shd w:fill="F4F5F5"/>
+          </w:tcPr>
+          <w:p>
+            <w:pPr>
+              <w:spacing w:after="40" w:line="262" w:before="0" w:lineRule="auto"/>
+            </w:pPr>
+            <w:r>
+              <w:rPr>
+                <w:rFonts w:ascii="Arial" w:cs="Times New Roman" w:eastAsia="Times New Roman" w:hAnsi="Arial"/>
+                <w:b w:val="0"/>
+                <w:bCs w:val="false"/>
+                <w:color w:val="293137"/>
+                <w:sz w:val="18"/>
+                <w:szCs w:val="22"/>
+              </w:rPr>
+              <w:t xml:space="preserve">лист «Опись» файла 03, ячейки B4 и D4</w:t>
             </w:r>
           </w:p>
         </w:tc>
@@ -2116,17 +2098,17 @@
           </w:tcPr>
           <w:p>
             <w:pPr>
-              <w:spacing w:after="0" w:line="240"/>
-            </w:pPr>
-            <w:r>
-              <w:rPr>
-                <w:rFonts w:ascii="Times New Roman" w:cs="Times New Roman" w:eastAsia="Times New Roman" w:hAnsi="Times New Roman"/>
-                <w:b/>
-                <w:bCs/>
-                <w:i w:val="false"/>
-                <w:iCs w:val="false"/>
-                <w:color w:val="000000"/>
-                <w:sz w:val="22"/>
+              <w:spacing w:after="40" w:line="262" w:before="0" w:lineRule="auto"/>
+            </w:pPr>
+            <w:r>
+              <w:rPr>
+                <w:rFonts w:ascii="Arial" w:cs="Times New Roman" w:eastAsia="Times New Roman" w:hAnsi="Arial"/>
+                <w:b/>
+                <w:bCs/>
+                <w:i w:val="false"/>
+                <w:iCs w:val="false"/>
+                <w:color w:val="293137"/>
+                <w:sz w:val="18"/>
                 <w:szCs w:val="22"/>
               </w:rPr>
               <w:t xml:space="preserve">{{ЧИСЛО_ПОЗИЦИЙ_ОПИСИ}}</w:t>
@@ -2145,17 +2127,18 @@
           </w:tcPr>
           <w:p>
             <w:pPr>
-              <w:spacing w:after="0" w:line="240"/>
-            </w:pPr>
-            <w:r>
-              <w:rPr>
-                <w:rFonts w:ascii="Times New Roman" w:cs="Times New Roman" w:eastAsia="Times New Roman" w:hAnsi="Times New Roman"/>
-                <w:b w:val="false"/>
-                <w:bCs w:val="false"/>
-                <w:sz w:val="22"/>
-                <w:szCs w:val="22"/>
-              </w:rPr>
-              <w:t xml:space="preserve">Сколько позиций в описи. Считается на листе «Опись» само</w:t>
+              <w:spacing w:after="40" w:line="262" w:before="0" w:lineRule="auto"/>
+            </w:pPr>
+            <w:r>
+              <w:rPr>
+                <w:rFonts w:ascii="Arial" w:cs="Times New Roman" w:eastAsia="Times New Roman" w:hAnsi="Arial"/>
+                <w:b w:val="0"/>
+                <w:bCs w:val="false"/>
+                <w:color w:val="293137"/>
+                <w:sz w:val="18"/>
+                <w:szCs w:val="22"/>
+              </w:rPr>
+              <w:t xml:space="preserve">Количество заполненных позиций по итогу листа «Опись»</w:t>
             </w:r>
           </w:p>
         </w:tc>
@@ -2171,17 +2154,18 @@
           </w:tcPr>
           <w:p>
             <w:pPr>
-              <w:spacing w:after="0" w:line="240"/>
-            </w:pPr>
-            <w:r>
-              <w:rPr>
-                <w:rFonts w:ascii="Times New Roman" w:cs="Times New Roman" w:eastAsia="Times New Roman" w:hAnsi="Times New Roman"/>
-                <w:b w:val="false"/>
-                <w:bCs w:val="false"/>
-                <w:sz w:val="22"/>
-                <w:szCs w:val="22"/>
-              </w:rPr>
-              <w:t xml:space="preserve">ячейка счётчика позиций файла 62</w:t>
+              <w:spacing w:after="40" w:line="262" w:before="0" w:lineRule="auto"/>
+            </w:pPr>
+            <w:r>
+              <w:rPr>
+                <w:rFonts w:ascii="Arial" w:cs="Times New Roman" w:eastAsia="Times New Roman" w:hAnsi="Arial"/>
+                <w:b w:val="0"/>
+                <w:bCs w:val="false"/>
+                <w:color w:val="293137"/>
+                <w:sz w:val="18"/>
+                <w:szCs w:val="22"/>
+              </w:rPr>
+              <w:t xml:space="preserve">файл 03, лист «Опись», ячейка C132</w:t>
             </w:r>
           </w:p>
         </w:tc>
@@ -2196,20 +2180,21 @@
               <w:bottom w:type="dxa" w:w="80"/>
               <w:right w:type="dxa" w:w="120"/>
             </w:tcMar>
-          </w:tcPr>
-          <w:p>
-            <w:pPr>
-              <w:spacing w:after="0" w:line="240"/>
-            </w:pPr>
-            <w:r>
-              <w:rPr>
-                <w:rFonts w:ascii="Times New Roman" w:cs="Times New Roman" w:eastAsia="Times New Roman" w:hAnsi="Times New Roman"/>
-                <w:b/>
-                <w:bCs/>
-                <w:i w:val="false"/>
-                <w:iCs w:val="false"/>
-                <w:color w:val="000000"/>
-                <w:sz w:val="22"/>
+            <w:shd w:fill="F4F5F5"/>
+          </w:tcPr>
+          <w:p>
+            <w:pPr>
+              <w:spacing w:after="40" w:line="262" w:before="0" w:lineRule="auto"/>
+            </w:pPr>
+            <w:r>
+              <w:rPr>
+                <w:rFonts w:ascii="Arial" w:cs="Times New Roman" w:eastAsia="Times New Roman" w:hAnsi="Arial"/>
+                <w:b/>
+                <w:bCs/>
+                <w:i w:val="false"/>
+                <w:iCs w:val="false"/>
+                <w:color w:val="293137"/>
+                <w:sz w:val="18"/>
                 <w:szCs w:val="22"/>
               </w:rPr>
               <w:t xml:space="preserve">{{ЧИСЛО_ЛИСТОВ}}</w:t>
@@ -2225,20 +2210,22 @@
               <w:bottom w:type="dxa" w:w="80"/>
               <w:right w:type="dxa" w:w="120"/>
             </w:tcMar>
-          </w:tcPr>
-          <w:p>
-            <w:pPr>
-              <w:spacing w:after="0" w:line="240"/>
-            </w:pPr>
-            <w:r>
-              <w:rPr>
-                <w:rFonts w:ascii="Times New Roman" w:cs="Times New Roman" w:eastAsia="Times New Roman" w:hAnsi="Times New Roman"/>
-                <w:b w:val="false"/>
-                <w:bCs w:val="false"/>
-                <w:sz w:val="22"/>
-                <w:szCs w:val="22"/>
-              </w:rPr>
-              <w:t xml:space="preserve">Общее число листов передаваемого комплекта. Считается на листе «Опись» само</w:t>
+            <w:shd w:fill="F4F5F5"/>
+          </w:tcPr>
+          <w:p>
+            <w:pPr>
+              <w:spacing w:after="40" w:line="262" w:before="0" w:lineRule="auto"/>
+            </w:pPr>
+            <w:r>
+              <w:rPr>
+                <w:rFonts w:ascii="Arial" w:cs="Times New Roman" w:eastAsia="Times New Roman" w:hAnsi="Arial"/>
+                <w:b w:val="0"/>
+                <w:bCs w:val="false"/>
+                <w:color w:val="293137"/>
+                <w:sz w:val="18"/>
+                <w:szCs w:val="22"/>
+              </w:rPr>
+              <w:t xml:space="preserve">Общее число листов передаваемых документов по итогу листа «Опись»</w:t>
             </w:r>
           </w:p>
         </w:tc>
@@ -2251,20 +2238,22 @@
               <w:bottom w:type="dxa" w:w="80"/>
               <w:right w:type="dxa" w:w="120"/>
             </w:tcMar>
-          </w:tcPr>
-          <w:p>
-            <w:pPr>
-              <w:spacing w:after="0" w:line="240"/>
-            </w:pPr>
-            <w:r>
-              <w:rPr>
-                <w:rFonts w:ascii="Times New Roman" w:cs="Times New Roman" w:eastAsia="Times New Roman" w:hAnsi="Times New Roman"/>
-                <w:b w:val="false"/>
-                <w:bCs w:val="false"/>
-                <w:sz w:val="22"/>
-                <w:szCs w:val="22"/>
-              </w:rPr>
-              <w:t xml:space="preserve">ячейка счётчика листов файла 62</w:t>
+            <w:shd w:fill="F4F5F5"/>
+          </w:tcPr>
+          <w:p>
+            <w:pPr>
+              <w:spacing w:after="40" w:line="262" w:before="0" w:lineRule="auto"/>
+            </w:pPr>
+            <w:r>
+              <w:rPr>
+                <w:rFonts w:ascii="Arial" w:cs="Times New Roman" w:eastAsia="Times New Roman" w:hAnsi="Arial"/>
+                <w:b w:val="0"/>
+                <w:bCs w:val="false"/>
+                <w:color w:val="293137"/>
+                <w:sz w:val="18"/>
+                <w:szCs w:val="22"/>
+              </w:rPr>
+              <w:t xml:space="preserve">файл 03, лист «Опись», ячейка E132</w:t>
             </w:r>
           </w:p>
         </w:tc>
@@ -2282,17 +2271,17 @@
           </w:tcPr>
           <w:p>
             <w:pPr>
-              <w:spacing w:after="0" w:line="240"/>
-            </w:pPr>
-            <w:r>
-              <w:rPr>
-                <w:rFonts w:ascii="Times New Roman" w:cs="Times New Roman" w:eastAsia="Times New Roman" w:hAnsi="Times New Roman"/>
-                <w:b/>
-                <w:bCs/>
-                <w:i w:val="false"/>
-                <w:iCs w:val="false"/>
-                <w:color w:val="000000"/>
-                <w:sz w:val="22"/>
+              <w:spacing w:after="40" w:line="262" w:before="0" w:lineRule="auto"/>
+            </w:pPr>
+            <w:r>
+              <w:rPr>
+                <w:rFonts w:ascii="Arial" w:cs="Times New Roman" w:eastAsia="Times New Roman" w:hAnsi="Arial"/>
+                <w:b/>
+                <w:bCs/>
+                <w:i w:val="false"/>
+                <w:iCs w:val="false"/>
+                <w:color w:val="293137"/>
+                <w:sz w:val="18"/>
                 <w:szCs w:val="22"/>
               </w:rPr>
               <w:t xml:space="preserve">{{ЧИСЛО_ЭКЗЕМПЛЯРОВ}}</w:t>
@@ -2311,14 +2300,15 @@
           </w:tcPr>
           <w:p>
             <w:pPr>
-              <w:spacing w:after="0" w:line="240"/>
-            </w:pPr>
-            <w:r>
-              <w:rPr>
-                <w:rFonts w:ascii="Times New Roman" w:cs="Times New Roman" w:eastAsia="Times New Roman" w:hAnsi="Times New Roman"/>
-                <w:b w:val="false"/>
-                <w:bCs w:val="false"/>
-                <w:sz w:val="22"/>
+              <w:spacing w:after="40" w:line="262" w:before="0" w:lineRule="auto"/>
+            </w:pPr>
+            <w:r>
+              <w:rPr>
+                <w:rFonts w:ascii="Arial" w:cs="Times New Roman" w:eastAsia="Times New Roman" w:hAnsi="Arial"/>
+                <w:b w:val="0"/>
+                <w:bCs w:val="false"/>
+                <w:color w:val="293137"/>
+                <w:sz w:val="18"/>
                 <w:szCs w:val="22"/>
               </w:rPr>
               <w:t xml:space="preserve">В скольких экземплярах передан комплект</w:t>
@@ -2337,14 +2327,15 @@
           </w:tcPr>
           <w:p>
             <w:pPr>
-              <w:spacing w:after="0" w:line="240"/>
-            </w:pPr>
-            <w:r>
-              <w:rPr>
-                <w:rFonts w:ascii="Times New Roman" w:cs="Times New Roman" w:eastAsia="Times New Roman" w:hAnsi="Times New Roman"/>
-                <w:b w:val="false"/>
-                <w:bCs w:val="false"/>
-                <w:sz w:val="22"/>
+              <w:spacing w:after="40" w:line="262" w:before="0" w:lineRule="auto"/>
+            </w:pPr>
+            <w:r>
+              <w:rPr>
+                <w:rFonts w:ascii="Arial" w:cs="Times New Roman" w:eastAsia="Times New Roman" w:hAnsi="Arial"/>
+                <w:b w:val="0"/>
+                <w:bCs w:val="false"/>
+                <w:color w:val="293137"/>
+                <w:sz w:val="18"/>
                 <w:szCs w:val="22"/>
               </w:rPr>
               <w:t xml:space="preserve">договор; если не установлено — ваше решение, записанное в описи</w:t>
@@ -2362,20 +2353,21 @@
               <w:bottom w:type="dxa" w:w="80"/>
               <w:right w:type="dxa" w:w="120"/>
             </w:tcMar>
-          </w:tcPr>
-          <w:p>
-            <w:pPr>
-              <w:spacing w:after="0" w:line="240"/>
-            </w:pPr>
-            <w:r>
-              <w:rPr>
-                <w:rFonts w:ascii="Times New Roman" w:cs="Times New Roman" w:eastAsia="Times New Roman" w:hAnsi="Times New Roman"/>
-                <w:b/>
-                <w:bCs/>
-                <w:i w:val="false"/>
-                <w:iCs w:val="false"/>
-                <w:color w:val="000000"/>
-                <w:sz w:val="22"/>
+            <w:shd w:fill="F4F5F5"/>
+          </w:tcPr>
+          <w:p>
+            <w:pPr>
+              <w:spacing w:after="40" w:line="262" w:before="0" w:lineRule="auto"/>
+            </w:pPr>
+            <w:r>
+              <w:rPr>
+                <w:rFonts w:ascii="Arial" w:cs="Times New Roman" w:eastAsia="Times New Roman" w:hAnsi="Arial"/>
+                <w:b/>
+                <w:bCs/>
+                <w:i w:val="false"/>
+                <w:iCs w:val="false"/>
+                <w:color w:val="293137"/>
+                <w:sz w:val="18"/>
                 <w:szCs w:val="22"/>
               </w:rPr>
               <w:t xml:space="preserve">{{СПОСОБ_ПЕРЕДАЧИ}}</w:t>
@@ -2391,17 +2383,19 @@
               <w:bottom w:type="dxa" w:w="80"/>
               <w:right w:type="dxa" w:w="120"/>
             </w:tcMar>
-          </w:tcPr>
-          <w:p>
-            <w:pPr>
-              <w:spacing w:after="0" w:line="240"/>
-            </w:pPr>
-            <w:r>
-              <w:rPr>
-                <w:rFonts w:ascii="Times New Roman" w:cs="Times New Roman" w:eastAsia="Times New Roman" w:hAnsi="Times New Roman"/>
-                <w:b w:val="false"/>
-                <w:bCs w:val="false"/>
-                <w:sz w:val="22"/>
+            <w:shd w:fill="F4F5F5"/>
+          </w:tcPr>
+          <w:p>
+            <w:pPr>
+              <w:spacing w:after="40" w:line="262" w:before="0" w:lineRule="auto"/>
+            </w:pPr>
+            <w:r>
+              <w:rPr>
+                <w:rFonts w:ascii="Arial" w:cs="Times New Roman" w:eastAsia="Times New Roman" w:hAnsi="Arial"/>
+                <w:b w:val="0"/>
+                <w:bCs w:val="false"/>
+                <w:color w:val="293137"/>
+                <w:sz w:val="18"/>
                 <w:szCs w:val="22"/>
               </w:rPr>
               <w:t xml:space="preserve">Как передан комплект: нарочно под подпись, почтой с описью вложения, через систему электронного документооборота с номером отправления</w:t>
@@ -2417,17 +2411,19 @@
               <w:bottom w:type="dxa" w:w="80"/>
               <w:right w:type="dxa" w:w="120"/>
             </w:tcMar>
-          </w:tcPr>
-          <w:p>
-            <w:pPr>
-              <w:spacing w:after="0" w:line="240"/>
-            </w:pPr>
-            <w:r>
-              <w:rPr>
-                <w:rFonts w:ascii="Times New Roman" w:cs="Times New Roman" w:eastAsia="Times New Roman" w:hAnsi="Times New Roman"/>
-                <w:b w:val="false"/>
-                <w:bCs w:val="false"/>
-                <w:sz w:val="22"/>
+            <w:shd w:fill="F4F5F5"/>
+          </w:tcPr>
+          <w:p>
+            <w:pPr>
+              <w:spacing w:after="40" w:line="262" w:before="0" w:lineRule="auto"/>
+            </w:pPr>
+            <w:r>
+              <w:rPr>
+                <w:rFonts w:ascii="Arial" w:cs="Times New Roman" w:eastAsia="Times New Roman" w:hAnsi="Arial"/>
+                <w:b w:val="0"/>
+                <w:bCs w:val="false"/>
+                <w:color w:val="293137"/>
+                <w:sz w:val="18"/>
                 <w:szCs w:val="22"/>
               </w:rPr>
               <w:t xml:space="preserve">ваше решение, согласованное с порядком из договора</w:t>
@@ -2448,40 +2444,41 @@
           </w:tcPr>
           <w:p>
             <w:pPr>
-              <w:spacing w:after="0" w:line="240"/>
-            </w:pPr>
-            <w:r>
-              <w:rPr>
-                <w:rFonts w:ascii="Times New Roman" w:cs="Times New Roman" w:eastAsia="Times New Roman" w:hAnsi="Times New Roman"/>
-                <w:b/>
-                <w:bCs/>
-                <w:i w:val="false"/>
-                <w:iCs w:val="false"/>
-                <w:color w:val="000000"/>
-                <w:sz w:val="22"/>
+              <w:spacing w:after="40" w:line="262" w:before="0" w:lineRule="auto"/>
+            </w:pPr>
+            <w:r>
+              <w:rPr>
+                <w:rFonts w:ascii="Arial" w:cs="Times New Roman" w:eastAsia="Times New Roman" w:hAnsi="Arial"/>
+                <w:b/>
+                <w:bCs/>
+                <w:i w:val="false"/>
+                <w:iCs w:val="false"/>
+                <w:color w:val="293137"/>
+                <w:sz w:val="18"/>
                 <w:szCs w:val="22"/>
               </w:rPr>
               <w:t xml:space="preserve">{{ФИО_ОТВЕТСТВЕННОГО}}</w:t>
             </w:r>
             <w:r>
               <w:rPr>
-                <w:rFonts w:ascii="Times New Roman" w:cs="Times New Roman" w:eastAsia="Times New Roman" w:hAnsi="Times New Roman"/>
-                <w:b w:val="false"/>
-                <w:bCs w:val="false"/>
-                <w:sz w:val="22"/>
+                <w:rFonts w:ascii="Arial" w:cs="Times New Roman" w:eastAsia="Times New Roman" w:hAnsi="Arial"/>
+                <w:b w:val="0"/>
+                <w:bCs w:val="false"/>
+                <w:color w:val="293137"/>
+                <w:sz w:val="18"/>
                 <w:szCs w:val="22"/>
               </w:rPr>
               <w:t xml:space="preserve">, </w:t>
             </w:r>
             <w:r>
               <w:rPr>
-                <w:rFonts w:ascii="Times New Roman" w:cs="Times New Roman" w:eastAsia="Times New Roman" w:hAnsi="Times New Roman"/>
-                <w:b/>
-                <w:bCs/>
-                <w:i w:val="false"/>
-                <w:iCs w:val="false"/>
-                <w:color w:val="000000"/>
-                <w:sz w:val="22"/>
+                <w:rFonts w:ascii="Arial" w:cs="Times New Roman" w:eastAsia="Times New Roman" w:hAnsi="Arial"/>
+                <w:b/>
+                <w:bCs/>
+                <w:i w:val="false"/>
+                <w:iCs w:val="false"/>
+                <w:color w:val="293137"/>
+                <w:sz w:val="18"/>
                 <w:szCs w:val="22"/>
               </w:rPr>
               <w:t xml:space="preserve">{{КОНТАКТ_ОТВЕТСТВЕННОГО}}</w:t>
@@ -2500,17 +2497,18 @@
           </w:tcPr>
           <w:p>
             <w:pPr>
-              <w:spacing w:after="0" w:line="240"/>
-            </w:pPr>
-            <w:r>
-              <w:rPr>
-                <w:rFonts w:ascii="Times New Roman" w:cs="Times New Roman" w:eastAsia="Times New Roman" w:hAnsi="Times New Roman"/>
-                <w:b w:val="false"/>
-                <w:bCs w:val="false"/>
-                <w:sz w:val="22"/>
-                <w:szCs w:val="22"/>
-              </w:rPr>
-              <w:t xml:space="preserve">Кто с вашей стороны отвечает на вопросы по комплекту: имя, телефон, почта. Без контактного лица вопросы уходят не в разбор, а в паузу</w:t>
+              <w:spacing w:after="40" w:line="262" w:before="0" w:lineRule="auto"/>
+            </w:pPr>
+            <w:r>
+              <w:rPr>
+                <w:rFonts w:ascii="Arial" w:cs="Times New Roman" w:eastAsia="Times New Roman" w:hAnsi="Arial"/>
+                <w:b w:val="0"/>
+                <w:bCs w:val="false"/>
+                <w:color w:val="293137"/>
+                <w:sz w:val="18"/>
+                <w:szCs w:val="22"/>
+              </w:rPr>
+              <w:t xml:space="preserve">ФИО, телефон и электронная почта ответственного за передачу документации</w:t>
             </w:r>
           </w:p>
         </w:tc>
@@ -2526,14 +2524,15 @@
           </w:tcPr>
           <w:p>
             <w:pPr>
-              <w:spacing w:after="0" w:line="240"/>
-            </w:pPr>
-            <w:r>
-              <w:rPr>
-                <w:rFonts w:ascii="Times New Roman" w:cs="Times New Roman" w:eastAsia="Times New Roman" w:hAnsi="Times New Roman"/>
-                <w:b w:val="false"/>
-                <w:bCs w:val="false"/>
-                <w:sz w:val="22"/>
+              <w:spacing w:after="40" w:line="262" w:before="0" w:lineRule="auto"/>
+            </w:pPr>
+            <w:r>
+              <w:rPr>
+                <w:rFonts w:ascii="Arial" w:cs="Times New Roman" w:eastAsia="Times New Roman" w:hAnsi="Arial"/>
+                <w:b w:val="0"/>
+                <w:bCs w:val="false"/>
+                <w:color w:val="293137"/>
+                <w:sz w:val="18"/>
                 <w:szCs w:val="22"/>
               </w:rPr>
               <w:t xml:space="preserve">ваше решение</w:t>
@@ -2551,66 +2550,69 @@
               <w:bottom w:type="dxa" w:w="80"/>
               <w:right w:type="dxa" w:w="120"/>
             </w:tcMar>
-          </w:tcPr>
-          <w:p>
-            <w:pPr>
-              <w:spacing w:after="0" w:line="240"/>
-            </w:pPr>
-            <w:r>
-              <w:rPr>
-                <w:rFonts w:ascii="Times New Roman" w:cs="Times New Roman" w:eastAsia="Times New Roman" w:hAnsi="Times New Roman"/>
-                <w:b/>
-                <w:bCs/>
-                <w:i w:val="false"/>
-                <w:iCs w:val="false"/>
-                <w:color w:val="000000"/>
-                <w:sz w:val="22"/>
+            <w:shd w:fill="F4F5F5"/>
+          </w:tcPr>
+          <w:p>
+            <w:pPr>
+              <w:spacing w:after="40" w:line="262" w:before="0" w:lineRule="auto"/>
+            </w:pPr>
+            <w:r>
+              <w:rPr>
+                <w:rFonts w:ascii="Arial" w:cs="Times New Roman" w:eastAsia="Times New Roman" w:hAnsi="Arial"/>
+                <w:b/>
+                <w:bCs/>
+                <w:i w:val="false"/>
+                <w:iCs w:val="false"/>
+                <w:color w:val="293137"/>
+                <w:sz w:val="18"/>
                 <w:szCs w:val="22"/>
               </w:rPr>
               <w:t xml:space="preserve">{{НОМЕР_АКТА}}</w:t>
             </w:r>
             <w:r>
               <w:rPr>
-                <w:rFonts w:ascii="Times New Roman" w:cs="Times New Roman" w:eastAsia="Times New Roman" w:hAnsi="Times New Roman"/>
-                <w:b w:val="false"/>
-                <w:bCs w:val="false"/>
-                <w:sz w:val="22"/>
+                <w:rFonts w:ascii="Arial" w:cs="Times New Roman" w:eastAsia="Times New Roman" w:hAnsi="Arial"/>
+                <w:b w:val="0"/>
+                <w:bCs w:val="false"/>
+                <w:color w:val="293137"/>
+                <w:sz w:val="18"/>
                 <w:szCs w:val="22"/>
               </w:rPr>
               <w:t xml:space="preserve">, </w:t>
             </w:r>
             <w:r>
               <w:rPr>
-                <w:rFonts w:ascii="Times New Roman" w:cs="Times New Roman" w:eastAsia="Times New Roman" w:hAnsi="Times New Roman"/>
-                <w:b/>
-                <w:bCs/>
-                <w:i w:val="false"/>
-                <w:iCs w:val="false"/>
-                <w:color w:val="000000"/>
-                <w:sz w:val="22"/>
+                <w:rFonts w:ascii="Arial" w:cs="Times New Roman" w:eastAsia="Times New Roman" w:hAnsi="Arial"/>
+                <w:b/>
+                <w:bCs/>
+                <w:i w:val="false"/>
+                <w:iCs w:val="false"/>
+                <w:color w:val="293137"/>
+                <w:sz w:val="18"/>
                 <w:szCs w:val="22"/>
               </w:rPr>
               <w:t xml:space="preserve">{{ДАТА_АКТА}}</w:t>
             </w:r>
             <w:r>
               <w:rPr>
-                <w:rFonts w:ascii="Times New Roman" w:cs="Times New Roman" w:eastAsia="Times New Roman" w:hAnsi="Times New Roman"/>
-                <w:b w:val="false"/>
-                <w:bCs w:val="false"/>
-                <w:sz w:val="22"/>
+                <w:rFonts w:ascii="Arial" w:cs="Times New Roman" w:eastAsia="Times New Roman" w:hAnsi="Arial"/>
+                <w:b w:val="0"/>
+                <w:bCs w:val="false"/>
+                <w:color w:val="293137"/>
+                <w:sz w:val="18"/>
                 <w:szCs w:val="22"/>
               </w:rPr>
               <w:t xml:space="preserve">, </w:t>
             </w:r>
             <w:r>
               <w:rPr>
-                <w:rFonts w:ascii="Times New Roman" w:cs="Times New Roman" w:eastAsia="Times New Roman" w:hAnsi="Times New Roman"/>
-                <w:b/>
-                <w:bCs/>
-                <w:i w:val="false"/>
-                <w:iCs w:val="false"/>
-                <w:color w:val="000000"/>
-                <w:sz w:val="22"/>
+                <w:rFonts w:ascii="Arial" w:cs="Times New Roman" w:eastAsia="Times New Roman" w:hAnsi="Arial"/>
+                <w:b/>
+                <w:bCs/>
+                <w:i w:val="false"/>
+                <w:iCs w:val="false"/>
+                <w:color w:val="293137"/>
+                <w:sz w:val="18"/>
                 <w:szCs w:val="22"/>
               </w:rPr>
               <w:t xml:space="preserve">{{МЕСТО_СОСТАВЛЕНИЯ}}</w:t>
@@ -2626,17 +2628,19 @@
               <w:bottom w:type="dxa" w:w="80"/>
               <w:right w:type="dxa" w:w="120"/>
             </w:tcMar>
-          </w:tcPr>
-          <w:p>
-            <w:pPr>
-              <w:spacing w:after="0" w:line="240"/>
-            </w:pPr>
-            <w:r>
-              <w:rPr>
-                <w:rFonts w:ascii="Times New Roman" w:cs="Times New Roman" w:eastAsia="Times New Roman" w:hAnsi="Times New Roman"/>
-                <w:b w:val="false"/>
-                <w:bCs w:val="false"/>
-                <w:sz w:val="22"/>
+            <w:shd w:fill="F4F5F5"/>
+          </w:tcPr>
+          <w:p>
+            <w:pPr>
+              <w:spacing w:after="40" w:line="262" w:before="0" w:lineRule="auto"/>
+            </w:pPr>
+            <w:r>
+              <w:rPr>
+                <w:rFonts w:ascii="Arial" w:cs="Times New Roman" w:eastAsia="Times New Roman" w:hAnsi="Arial"/>
+                <w:b w:val="0"/>
+                <w:bCs w:val="false"/>
+                <w:color w:val="293137"/>
+                <w:sz w:val="18"/>
                 <w:szCs w:val="22"/>
               </w:rPr>
               <w:t xml:space="preserve">Реквизиты акта приёма-передачи документации</w:t>
@@ -2652,17 +2656,19 @@
               <w:bottom w:type="dxa" w:w="80"/>
               <w:right w:type="dxa" w:w="120"/>
             </w:tcMar>
-          </w:tcPr>
-          <w:p>
-            <w:pPr>
-              <w:spacing w:after="0" w:line="240"/>
-            </w:pPr>
-            <w:r>
-              <w:rPr>
-                <w:rFonts w:ascii="Times New Roman" w:cs="Times New Roman" w:eastAsia="Times New Roman" w:hAnsi="Times New Roman"/>
-                <w:b w:val="false"/>
-                <w:bCs w:val="false"/>
-                <w:sz w:val="22"/>
+            <w:shd w:fill="F4F5F5"/>
+          </w:tcPr>
+          <w:p>
+            <w:pPr>
+              <w:spacing w:after="40" w:line="262" w:before="0" w:lineRule="auto"/>
+            </w:pPr>
+            <w:r>
+              <w:rPr>
+                <w:rFonts w:ascii="Arial" w:cs="Times New Roman" w:eastAsia="Times New Roman" w:hAnsi="Arial"/>
+                <w:b w:val="0"/>
+                <w:bCs w:val="false"/>
+                <w:color w:val="293137"/>
+                <w:sz w:val="18"/>
                 <w:szCs w:val="22"/>
               </w:rPr>
               <w:t xml:space="preserve">заполняются в день передачи</w:t>
@@ -2683,40 +2689,41 @@
           </w:tcPr>
           <w:p>
             <w:pPr>
-              <w:spacing w:after="0" w:line="240"/>
-            </w:pPr>
-            <w:r>
-              <w:rPr>
-                <w:rFonts w:ascii="Times New Roman" w:cs="Times New Roman" w:eastAsia="Times New Roman" w:hAnsi="Times New Roman"/>
-                <w:b/>
-                <w:bCs/>
-                <w:i w:val="false"/>
-                <w:iCs w:val="false"/>
-                <w:color w:val="000000"/>
-                <w:sz w:val="22"/>
+              <w:spacing w:after="40" w:line="262" w:before="0" w:lineRule="auto"/>
+            </w:pPr>
+            <w:r>
+              <w:rPr>
+                <w:rFonts w:ascii="Arial" w:cs="Times New Roman" w:eastAsia="Times New Roman" w:hAnsi="Arial"/>
+                <w:b/>
+                <w:bCs/>
+                <w:i w:val="false"/>
+                <w:iCs w:val="false"/>
+                <w:color w:val="293137"/>
+                <w:sz w:val="18"/>
                 <w:szCs w:val="22"/>
               </w:rPr>
               <w:t xml:space="preserve">{{ДОЛЖНОСТЬ_ПРЕДСТАВИТЕЛЯ_ЗАКАЗЧИКА}}</w:t>
             </w:r>
             <w:r>
               <w:rPr>
-                <w:rFonts w:ascii="Times New Roman" w:cs="Times New Roman" w:eastAsia="Times New Roman" w:hAnsi="Times New Roman"/>
-                <w:b w:val="false"/>
-                <w:bCs w:val="false"/>
-                <w:sz w:val="22"/>
+                <w:rFonts w:ascii="Arial" w:cs="Times New Roman" w:eastAsia="Times New Roman" w:hAnsi="Arial"/>
+                <w:b w:val="0"/>
+                <w:bCs w:val="false"/>
+                <w:color w:val="293137"/>
+                <w:sz w:val="18"/>
                 <w:szCs w:val="22"/>
               </w:rPr>
               <w:t xml:space="preserve">, </w:t>
             </w:r>
             <w:r>
               <w:rPr>
-                <w:rFonts w:ascii="Times New Roman" w:cs="Times New Roman" w:eastAsia="Times New Roman" w:hAnsi="Times New Roman"/>
-                <w:b/>
-                <w:bCs/>
-                <w:i w:val="false"/>
-                <w:iCs w:val="false"/>
-                <w:color w:val="000000"/>
-                <w:sz w:val="22"/>
+                <w:rFonts w:ascii="Arial" w:cs="Times New Roman" w:eastAsia="Times New Roman" w:hAnsi="Arial"/>
+                <w:b/>
+                <w:bCs/>
+                <w:i w:val="false"/>
+                <w:iCs w:val="false"/>
+                <w:color w:val="293137"/>
+                <w:sz w:val="18"/>
                 <w:szCs w:val="22"/>
               </w:rPr>
               <w:t xml:space="preserve">{{ФИО_ПРЕДСТАВИТЕЛЯ_ЗАКАЗЧИКА}}</w:t>
@@ -2735,17 +2742,18 @@
           </w:tcPr>
           <w:p>
             <w:pPr>
-              <w:spacing w:after="0" w:line="240"/>
-            </w:pPr>
-            <w:r>
-              <w:rPr>
-                <w:rFonts w:ascii="Times New Roman" w:cs="Times New Roman" w:eastAsia="Times New Roman" w:hAnsi="Times New Roman"/>
-                <w:b w:val="false"/>
-                <w:bCs w:val="false"/>
-                <w:sz w:val="22"/>
-                <w:szCs w:val="22"/>
-              </w:rPr>
-              <w:t xml:space="preserve">Кто принимает комплект со стороны заказчика. Принимающий без полномочий превращает акт в бумагу без адресата</w:t>
+              <w:spacing w:after="40" w:line="262" w:before="0" w:lineRule="auto"/>
+            </w:pPr>
+            <w:r>
+              <w:rPr>
+                <w:rFonts w:ascii="Arial" w:cs="Times New Roman" w:eastAsia="Times New Roman" w:hAnsi="Arial"/>
+                <w:b w:val="0"/>
+                <w:bCs w:val="false"/>
+                <w:color w:val="293137"/>
+                <w:sz w:val="18"/>
+                <w:szCs w:val="22"/>
+              </w:rPr>
+              <w:t xml:space="preserve">Должность и ФИО представителя Заказчика, уполномоченного принять документацию</w:t>
             </w:r>
           </w:p>
         </w:tc>
@@ -2761,14 +2769,15 @@
           </w:tcPr>
           <w:p>
             <w:pPr>
-              <w:spacing w:after="0" w:line="240"/>
-            </w:pPr>
-            <w:r>
-              <w:rPr>
-                <w:rFonts w:ascii="Times New Roman" w:cs="Times New Roman" w:eastAsia="Times New Roman" w:hAnsi="Times New Roman"/>
-                <w:b w:val="false"/>
-                <w:bCs w:val="false"/>
-                <w:sz w:val="22"/>
+              <w:spacing w:after="40" w:line="262" w:before="0" w:lineRule="auto"/>
+            </w:pPr>
+            <w:r>
+              <w:rPr>
+                <w:rFonts w:ascii="Arial" w:cs="Times New Roman" w:eastAsia="Times New Roman" w:hAnsi="Arial"/>
+                <w:b w:val="0"/>
+                <w:bCs w:val="false"/>
+                <w:color w:val="293137"/>
+                <w:sz w:val="18"/>
                 <w:szCs w:val="22"/>
               </w:rPr>
               <w:t xml:space="preserve">доверенность, приказ, пункт договора об уполномоченных лицах</w:t>
@@ -2786,20 +2795,21 @@
               <w:bottom w:type="dxa" w:w="80"/>
               <w:right w:type="dxa" w:w="120"/>
             </w:tcMar>
-          </w:tcPr>
-          <w:p>
-            <w:pPr>
-              <w:spacing w:after="0" w:line="240"/>
-            </w:pPr>
-            <w:r>
-              <w:rPr>
-                <w:rFonts w:ascii="Times New Roman" w:cs="Times New Roman" w:eastAsia="Times New Roman" w:hAnsi="Times New Roman"/>
-                <w:b/>
-                <w:bCs/>
-                <w:i w:val="false"/>
-                <w:iCs w:val="false"/>
-                <w:color w:val="000000"/>
-                <w:sz w:val="22"/>
+            <w:shd w:fill="F4F5F5"/>
+          </w:tcPr>
+          <w:p>
+            <w:pPr>
+              <w:spacing w:after="40" w:line="262" w:before="0" w:lineRule="auto"/>
+            </w:pPr>
+            <w:r>
+              <w:rPr>
+                <w:rFonts w:ascii="Arial" w:cs="Times New Roman" w:eastAsia="Times New Roman" w:hAnsi="Arial"/>
+                <w:b/>
+                <w:bCs/>
+                <w:i w:val="false"/>
+                <w:iCs w:val="false"/>
+                <w:color w:val="293137"/>
+                <w:sz w:val="18"/>
                 <w:szCs w:val="22"/>
               </w:rPr>
               <w:t xml:space="preserve">{{ОСНОВАНИЕ_ПОЛНОМОЧИЙ_ЗАКАЗЧИКА}}</w:t>
@@ -2815,20 +2825,22 @@
               <w:bottom w:type="dxa" w:w="80"/>
               <w:right w:type="dxa" w:w="120"/>
             </w:tcMar>
-          </w:tcPr>
-          <w:p>
-            <w:pPr>
-              <w:spacing w:after="0" w:line="240"/>
-            </w:pPr>
-            <w:r>
-              <w:rPr>
-                <w:rFonts w:ascii="Times New Roman" w:cs="Times New Roman" w:eastAsia="Times New Roman" w:hAnsi="Times New Roman"/>
-                <w:b w:val="false"/>
-                <w:bCs w:val="false"/>
-                <w:sz w:val="22"/>
-                <w:szCs w:val="22"/>
-              </w:rPr>
-              <w:t xml:space="preserve">«действующего на основании Устава» либо реквизиты доверенности принимающего</w:t>
+            <w:shd w:fill="F4F5F5"/>
+          </w:tcPr>
+          <w:p>
+            <w:pPr>
+              <w:spacing w:after="40" w:line="262" w:before="0" w:lineRule="auto"/>
+            </w:pPr>
+            <w:r>
+              <w:rPr>
+                <w:rFonts w:ascii="Arial" w:cs="Times New Roman" w:eastAsia="Times New Roman" w:hAnsi="Arial"/>
+                <w:b w:val="0"/>
+                <w:bCs w:val="false"/>
+                <w:color w:val="293137"/>
+                <w:sz w:val="18"/>
+                <w:szCs w:val="22"/>
+              </w:rPr>
+              <w:t xml:space="preserve">«Устава» либо «доверенности № … от …» принимающего представителя</w:t>
             </w:r>
           </w:p>
         </w:tc>
@@ -2841,17 +2853,19 @@
               <w:bottom w:type="dxa" w:w="80"/>
               <w:right w:type="dxa" w:w="120"/>
             </w:tcMar>
-          </w:tcPr>
-          <w:p>
-            <w:pPr>
-              <w:spacing w:after="0" w:line="240"/>
-            </w:pPr>
-            <w:r>
-              <w:rPr>
-                <w:rFonts w:ascii="Times New Roman" w:cs="Times New Roman" w:eastAsia="Times New Roman" w:hAnsi="Times New Roman"/>
-                <w:b w:val="false"/>
-                <w:bCs w:val="false"/>
-                <w:sz w:val="22"/>
+            <w:shd w:fill="F4F5F5"/>
+          </w:tcPr>
+          <w:p>
+            <w:pPr>
+              <w:spacing w:after="40" w:line="262" w:before="0" w:lineRule="auto"/>
+            </w:pPr>
+            <w:r>
+              <w:rPr>
+                <w:rFonts w:ascii="Arial" w:cs="Times New Roman" w:eastAsia="Times New Roman" w:hAnsi="Arial"/>
+                <w:b w:val="0"/>
+                <w:bCs w:val="false"/>
+                <w:color w:val="293137"/>
+                <w:sz w:val="18"/>
                 <w:szCs w:val="22"/>
               </w:rPr>
               <w:t xml:space="preserve">устав, доверенность</w:t>
@@ -2872,17 +2886,17 @@
           </w:tcPr>
           <w:p>
             <w:pPr>
-              <w:spacing w:after="0" w:line="240"/>
-            </w:pPr>
-            <w:r>
-              <w:rPr>
-                <w:rFonts w:ascii="Times New Roman" w:cs="Times New Roman" w:eastAsia="Times New Roman" w:hAnsi="Times New Roman"/>
-                <w:b/>
-                <w:bCs/>
-                <w:i w:val="false"/>
-                <w:iCs w:val="false"/>
-                <w:color w:val="000000"/>
-                <w:sz w:val="22"/>
+              <w:spacing w:after="40" w:line="262" w:before="0" w:lineRule="auto"/>
+            </w:pPr>
+            <w:r>
+              <w:rPr>
+                <w:rFonts w:ascii="Arial" w:cs="Times New Roman" w:eastAsia="Times New Roman" w:hAnsi="Arial"/>
+                <w:b/>
+                <w:bCs/>
+                <w:i w:val="false"/>
+                <w:iCs w:val="false"/>
+                <w:color w:val="293137"/>
+                <w:sz w:val="18"/>
                 <w:szCs w:val="22"/>
               </w:rPr>
               <w:t xml:space="preserve">{{ЗАМЕЧАНИЯ_ИЛИ_НЕТ}}</w:t>
@@ -2901,17 +2915,18 @@
           </w:tcPr>
           <w:p>
             <w:pPr>
-              <w:spacing w:after="0" w:line="240"/>
-            </w:pPr>
-            <w:r>
-              <w:rPr>
-                <w:rFonts w:ascii="Times New Roman" w:cs="Times New Roman" w:eastAsia="Times New Roman" w:hAnsi="Times New Roman"/>
-                <w:b w:val="false"/>
-                <w:bCs w:val="false"/>
-                <w:sz w:val="22"/>
-                <w:szCs w:val="22"/>
-              </w:rPr>
-              <w:t xml:space="preserve">Замечания к комплекту в момент передачи: «замечаний нет» либо перечень. Пустое место в этом пункте — самая дорогая пустая строка акта</w:t>
+              <w:spacing w:after="40" w:line="262" w:before="0" w:lineRule="auto"/>
+            </w:pPr>
+            <w:r>
+              <w:rPr>
+                <w:rFonts w:ascii="Arial" w:cs="Times New Roman" w:eastAsia="Times New Roman" w:hAnsi="Arial"/>
+                <w:b w:val="0"/>
+                <w:bCs w:val="false"/>
+                <w:color w:val="293137"/>
+                <w:sz w:val="18"/>
+                <w:szCs w:val="22"/>
+              </w:rPr>
+              <w:t xml:space="preserve">Замечания, заявленные при передаче, по позициям описи либо запись «замечаний при передаче не заявлено»</w:t>
             </w:r>
           </w:p>
         </w:tc>
@@ -2927,14 +2942,15 @@
           </w:tcPr>
           <w:p>
             <w:pPr>
-              <w:spacing w:after="0" w:line="240"/>
-            </w:pPr>
-            <w:r>
-              <w:rPr>
-                <w:rFonts w:ascii="Times New Roman" w:cs="Times New Roman" w:eastAsia="Times New Roman" w:hAnsi="Times New Roman"/>
-                <w:b w:val="false"/>
-                <w:bCs w:val="false"/>
-                <w:sz w:val="22"/>
+              <w:spacing w:after="40" w:line="262" w:before="0" w:lineRule="auto"/>
+            </w:pPr>
+            <w:r>
+              <w:rPr>
+                <w:rFonts w:ascii="Arial" w:cs="Times New Roman" w:eastAsia="Times New Roman" w:hAnsi="Arial"/>
+                <w:b w:val="0"/>
+                <w:bCs w:val="false"/>
+                <w:color w:val="293137"/>
+                <w:sz w:val="18"/>
                 <w:szCs w:val="22"/>
               </w:rPr>
               <w:t xml:space="preserve">заполняется при передаче, обеими сторонами</w:t>
@@ -2945,42 +2961,12 @@
     </w:tbl>
     <w:p>
       <w:pPr>
-        <w:spacing w:after="120" w:line="276"/>
+        <w:spacing w:after="80" w:line="269" w:before="0" w:lineRule="auto"/>
       </w:pPr>
-    </w:p>
-    <w:p>
-      <w:pPr>
-        <w:pStyle w:val="Heading2"/>
-        <w:keepNext/>
-        <w:spacing w:after="120" w:before="260"/>
-      </w:pPr>
-      <w:r>
-        <w:rPr>
-          <w:rFonts w:ascii="Times New Roman" w:cs="Times New Roman" w:eastAsia="Times New Roman" w:hAnsi="Times New Roman"/>
-          <w:b/>
-          <w:bCs/>
-          <w:sz w:val="26"/>
-          <w:szCs w:val="26"/>
-        </w:rPr>
-        <w:t xml:space="preserve">Чего в этих полях нет</w:t>
-      </w:r>
-    </w:p>
-    <w:p>
-      <w:pPr>
-        <w:spacing w:after="120" w:line="276"/>
-      </w:pPr>
-      <w:r>
-        <w:rPr>
-          <w:rFonts w:ascii="Times New Roman" w:cs="Times New Roman" w:eastAsia="Times New Roman" w:hAnsi="Times New Roman"/>
-          <w:sz w:val="24"/>
-          <w:szCs w:val="24"/>
-        </w:rPr>
-        <w:t xml:space="preserve">Ни одного срока, установленного нормой, и ни одной ссылки на форму с номером. Срок рассмотрения комплекта — поле, которое заполняется словами вашего договора; наименования форм проверяются в действующей редакции на дату передачи. Число, вписанное в шаблон один раз, устаревает молча — и подписывает его не тот, кто его вписал.</w:t>
-      </w:r>
     </w:p>
     <w:sectPr>
       <w:pgSz w:w="11906" w:h="16838" w:orient="portrait"/>
-      <w:pgMar w:top="1133" w:right="850" w:bottom="1133" w:left="1417" w:header="708" w:footer="708" w:gutter="0"/>
+      <w:pgMar w:top="964" w:right="964" w:bottom="935" w:left="1332" w:header="397" w:footer="397" w:gutter="0"/>
       <w:pgNumType/>
       <w:docGrid w:linePitch="360"/>
     </w:sectPr>

</xml_diff>